<commit_message>
docs(F4): agregar changelog y mejorar el informe final
Se agrega docs/changelog.md con fecha, descripción, commit y justificación técnica de cada cambio entre F1 y F4, como pide la pauta. El informe final incorpora Git y GitHub como herramientas de control de versiones y amplía la reflexión técnica sobre eficiencia y escalabilidad.
</commit_message>
<xml_diff>
--- a/docs/informe_final_f4_grupo_5.docx
+++ b/docs/informe_final_f4_grupo_5.docx
@@ -4,7 +4,7 @@
   <w:body>
     <w:p>
       <w:pPr>
-        <w:ind w:left="3566"/>
+        <w:ind w:left="3600" w:hanging="34"/>
       </w:pPr>
       <w:r>
         <w:rPr>
@@ -935,8 +935,13 @@
       <w:pPr>
         <w:jc w:val="center"/>
       </w:pPr>
-      <w:r>
-        <w:t>Nayadeth Garrido Ibáñez</w:t>
+      <w:proofErr w:type="spellStart"/>
+      <w:r>
+        <w:t>Nayadeth</w:t>
+      </w:r>
+      <w:proofErr w:type="spellEnd"/>
+      <w:r>
+        <w:t xml:space="preserve"> Garrido Ibáñez</w:t>
       </w:r>
     </w:p>
     <w:p>
@@ -975,6 +980,7 @@
         <w:spacing w:after="200"/>
       </w:pPr>
       <w:r>
+        <w:lastRenderedPageBreak/>
         <w:t>Índice de contenidos</w:t>
       </w:r>
     </w:p>
@@ -984,7 +990,7 @@
         <w:tabs>
           <w:tab w:val="right" w:leader="dot" w:pos="9926"/>
         </w:tabs>
-        <w:spacing w:after="80" w:before="80"/>
+        <w:spacing w:before="80" w:after="80"/>
       </w:pPr>
       <w:r>
         <w:fldChar w:fldCharType="begin"/>
@@ -998,10 +1004,10 @@
       <w:hyperlink w:anchor="_Toc900101" w:history="1">
         <w:r>
           <w:rPr>
-            <w:noProof/>
             <w:b/>
-          </w:rPr>
-          <w:t xml:space="preserve">1. Introducción y contextualización</w:t>
+            <w:noProof/>
+          </w:rPr>
+          <w:t>1. Introducción y contextualización</w:t>
         </w:r>
         <w:r>
           <w:rPr>
@@ -1029,13 +1035,19 @@
             <w:noProof/>
             <w:webHidden/>
           </w:rPr>
+        </w:r>
+        <w:r>
+          <w:rPr>
+            <w:noProof/>
+            <w:webHidden/>
+          </w:rPr>
           <w:fldChar w:fldCharType="separate"/>
         </w:r>
         <w:r>
           <w:rPr>
-            <w:noProof/>
-            <w:webHidden/>
             <w:b/>
+            <w:noProof/>
+            <w:webHidden/>
           </w:rPr>
           <w:t>3</w:t>
         </w:r>
@@ -1054,15 +1066,15 @@
         <w:tabs>
           <w:tab w:val="right" w:leader="dot" w:pos="9926"/>
         </w:tabs>
-        <w:spacing w:after="80" w:before="80"/>
+        <w:spacing w:before="80" w:after="80"/>
       </w:pPr>
       <w:hyperlink w:anchor="_Toc900102" w:history="1">
         <w:r>
           <w:rPr>
-            <w:noProof/>
             <w:b/>
-          </w:rPr>
-          <w:t xml:space="preserve">2. Problema, objetivos e hipótesis</w:t>
+            <w:noProof/>
+          </w:rPr>
+          <w:t>2. Problema, objetivos e hipótesis</w:t>
         </w:r>
         <w:r>
           <w:rPr>
@@ -1090,13 +1102,19 @@
             <w:noProof/>
             <w:webHidden/>
           </w:rPr>
+        </w:r>
+        <w:r>
+          <w:rPr>
+            <w:noProof/>
+            <w:webHidden/>
+          </w:rPr>
           <w:fldChar w:fldCharType="separate"/>
         </w:r>
         <w:r>
           <w:rPr>
-            <w:noProof/>
-            <w:webHidden/>
             <w:b/>
+            <w:noProof/>
+            <w:webHidden/>
           </w:rPr>
           <w:t>3</w:t>
         </w:r>
@@ -1115,15 +1133,15 @@
         <w:tabs>
           <w:tab w:val="right" w:leader="dot" w:pos="9926"/>
         </w:tabs>
-        <w:spacing w:after="80" w:before="80"/>
+        <w:spacing w:before="80" w:after="80"/>
       </w:pPr>
       <w:hyperlink w:anchor="_Toc900103" w:history="1">
         <w:r>
           <w:rPr>
-            <w:noProof/>
             <w:b/>
-          </w:rPr>
-          <w:t xml:space="preserve">3. Metodología del desarrollo técnico</w:t>
+            <w:noProof/>
+          </w:rPr>
+          <w:t>3. Metodología del desarrollo técnico</w:t>
         </w:r>
         <w:r>
           <w:rPr>
@@ -1151,13 +1169,19 @@
             <w:noProof/>
             <w:webHidden/>
           </w:rPr>
+        </w:r>
+        <w:r>
+          <w:rPr>
+            <w:noProof/>
+            <w:webHidden/>
+          </w:rPr>
           <w:fldChar w:fldCharType="separate"/>
         </w:r>
         <w:r>
           <w:rPr>
-            <w:noProof/>
-            <w:webHidden/>
             <w:b/>
+            <w:noProof/>
+            <w:webHidden/>
           </w:rPr>
           <w:t>3</w:t>
         </w:r>
@@ -1183,7 +1207,7 @@
           <w:rPr>
             <w:noProof/>
           </w:rPr>
-          <w:t xml:space="preserve">3.1 Integración de las fases F1-F4</w:t>
+          <w:t>3.1 Integración de las fases F1-F4</w:t>
         </w:r>
         <w:r>
           <w:rPr>
@@ -1205,6 +1229,12 @@
             <w:webHidden/>
           </w:rPr>
           <w:instrText xml:space="preserve"> PAGEREF _Toc900104 \h </w:instrText>
+        </w:r>
+        <w:r>
+          <w:rPr>
+            <w:noProof/>
+            <w:webHidden/>
+          </w:rPr>
         </w:r>
         <w:r>
           <w:rPr>
@@ -1242,7 +1272,7 @@
           <w:rPr>
             <w:noProof/>
           </w:rPr>
-          <w:t xml:space="preserve">3.2 Herramientas, reproducibilidad y control de versiones</w:t>
+          <w:t>3.2 Herramientas, reproducibilidad y control de versiones</w:t>
         </w:r>
         <w:r>
           <w:rPr>
@@ -1264,6 +1294,12 @@
             <w:webHidden/>
           </w:rPr>
           <w:instrText xml:space="preserve"> PAGEREF _Toc900105 \h </w:instrText>
+        </w:r>
+        <w:r>
+          <w:rPr>
+            <w:noProof/>
+            <w:webHidden/>
+          </w:rPr>
         </w:r>
         <w:r>
           <w:rPr>
@@ -1301,7 +1337,7 @@
           <w:rPr>
             <w:noProof/>
           </w:rPr>
-          <w:t xml:space="preserve">3.3 Eficiencia, validación y programación orientada a objetos</w:t>
+          <w:t>3.3 Eficiencia, validación y programación orientada a objetos</w:t>
         </w:r>
         <w:r>
           <w:rPr>
@@ -1323,6 +1359,12 @@
             <w:webHidden/>
           </w:rPr>
           <w:instrText xml:space="preserve"> PAGEREF _Toc900106 \h </w:instrText>
+        </w:r>
+        <w:r>
+          <w:rPr>
+            <w:noProof/>
+            <w:webHidden/>
+          </w:rPr>
         </w:r>
         <w:r>
           <w:rPr>
@@ -1353,15 +1395,15 @@
         <w:tabs>
           <w:tab w:val="right" w:leader="dot" w:pos="9926"/>
         </w:tabs>
-        <w:spacing w:after="80" w:before="80"/>
+        <w:spacing w:before="80" w:after="80"/>
       </w:pPr>
       <w:hyperlink w:anchor="_Toc900107" w:history="1">
         <w:r>
           <w:rPr>
-            <w:noProof/>
             <w:b/>
-          </w:rPr>
-          <w:t xml:space="preserve">4. Resultados y discusión</w:t>
+            <w:noProof/>
+          </w:rPr>
+          <w:t>4. Resultados y discusión</w:t>
         </w:r>
         <w:r>
           <w:rPr>
@@ -1389,13 +1431,19 @@
             <w:noProof/>
             <w:webHidden/>
           </w:rPr>
+        </w:r>
+        <w:r>
+          <w:rPr>
+            <w:noProof/>
+            <w:webHidden/>
+          </w:rPr>
           <w:fldChar w:fldCharType="separate"/>
         </w:r>
         <w:r>
           <w:rPr>
-            <w:noProof/>
-            <w:webHidden/>
             <w:b/>
+            <w:noProof/>
+            <w:webHidden/>
           </w:rPr>
           <w:t>6</w:t>
         </w:r>
@@ -1421,7 +1469,7 @@
           <w:rPr>
             <w:noProof/>
           </w:rPr>
-          <w:t xml:space="preserve">4.1 Resultados por tamaño de proveedor</w:t>
+          <w:t>4.1 Resultados por tamaño de proveedor</w:t>
         </w:r>
         <w:r>
           <w:rPr>
@@ -1443,6 +1491,12 @@
             <w:webHidden/>
           </w:rPr>
           <w:instrText xml:space="preserve"> PAGEREF _Toc900108 \h </w:instrText>
+        </w:r>
+        <w:r>
+          <w:rPr>
+            <w:noProof/>
+            <w:webHidden/>
+          </w:rPr>
         </w:r>
         <w:r>
           <w:rPr>
@@ -1480,7 +1534,7 @@
           <w:rPr>
             <w:noProof/>
           </w:rPr>
-          <w:t xml:space="preserve">4.2 Resultados por tipo de licitación</w:t>
+          <w:t>4.2 Resultados por tipo de licitación</w:t>
         </w:r>
         <w:r>
           <w:rPr>
@@ -1502,6 +1556,12 @@
             <w:webHidden/>
           </w:rPr>
           <w:instrText xml:space="preserve"> PAGEREF _Toc900109 \h </w:instrText>
+        </w:r>
+        <w:r>
+          <w:rPr>
+            <w:noProof/>
+            <w:webHidden/>
+          </w:rPr>
         </w:r>
         <w:r>
           <w:rPr>
@@ -1539,7 +1599,7 @@
           <w:rPr>
             <w:noProof/>
           </w:rPr>
-          <w:t xml:space="preserve">4.3 Plazos de cierre y discusión</w:t>
+          <w:t>4.3 Plazos de cierre y discusión</w:t>
         </w:r>
         <w:r>
           <w:rPr>
@@ -1561,6 +1621,12 @@
             <w:webHidden/>
           </w:rPr>
           <w:instrText xml:space="preserve"> PAGEREF _Toc900110 \h </w:instrText>
+        </w:r>
+        <w:r>
+          <w:rPr>
+            <w:noProof/>
+            <w:webHidden/>
+          </w:rPr>
         </w:r>
         <w:r>
           <w:rPr>
@@ -1591,15 +1657,15 @@
         <w:tabs>
           <w:tab w:val="right" w:leader="dot" w:pos="9926"/>
         </w:tabs>
-        <w:spacing w:after="80" w:before="80"/>
+        <w:spacing w:before="80" w:after="80"/>
       </w:pPr>
       <w:hyperlink w:anchor="_Toc900111" w:history="1">
         <w:r>
           <w:rPr>
-            <w:noProof/>
             <w:b/>
-          </w:rPr>
-          <w:t xml:space="preserve">5. Conclusiones y recomendaciones</w:t>
+            <w:noProof/>
+          </w:rPr>
+          <w:t>5. Conclusiones y recomendaciones</w:t>
         </w:r>
         <w:r>
           <w:rPr>
@@ -1627,13 +1693,19 @@
             <w:noProof/>
             <w:webHidden/>
           </w:rPr>
+        </w:r>
+        <w:r>
+          <w:rPr>
+            <w:noProof/>
+            <w:webHidden/>
+          </w:rPr>
           <w:fldChar w:fldCharType="separate"/>
         </w:r>
         <w:r>
           <w:rPr>
-            <w:noProof/>
-            <w:webHidden/>
             <w:b/>
+            <w:noProof/>
+            <w:webHidden/>
           </w:rPr>
           <w:t>8</w:t>
         </w:r>
@@ -1652,15 +1724,15 @@
         <w:tabs>
           <w:tab w:val="right" w:leader="dot" w:pos="9926"/>
         </w:tabs>
-        <w:spacing w:after="80" w:before="80"/>
+        <w:spacing w:before="80" w:after="80"/>
       </w:pPr>
       <w:hyperlink w:anchor="_Toc900112" w:history="1">
         <w:r>
           <w:rPr>
-            <w:noProof/>
             <w:b/>
-          </w:rPr>
-          <w:t xml:space="preserve">6. Trazabilidad de mejoras</w:t>
+            <w:noProof/>
+          </w:rPr>
+          <w:t>6. Trazabilidad de mejoras</w:t>
         </w:r>
         <w:r>
           <w:rPr>
@@ -1688,13 +1760,19 @@
             <w:noProof/>
             <w:webHidden/>
           </w:rPr>
+        </w:r>
+        <w:r>
+          <w:rPr>
+            <w:noProof/>
+            <w:webHidden/>
+          </w:rPr>
           <w:fldChar w:fldCharType="separate"/>
         </w:r>
         <w:r>
           <w:rPr>
-            <w:noProof/>
-            <w:webHidden/>
             <w:b/>
+            <w:noProof/>
+            <w:webHidden/>
           </w:rPr>
           <w:t>9</w:t>
         </w:r>
@@ -1713,15 +1791,15 @@
         <w:tabs>
           <w:tab w:val="right" w:leader="dot" w:pos="9926"/>
         </w:tabs>
-        <w:spacing w:after="80" w:before="80"/>
+        <w:spacing w:before="80" w:after="80"/>
       </w:pPr>
       <w:hyperlink w:anchor="_Toc900113" w:history="1">
         <w:r>
           <w:rPr>
-            <w:noProof/>
             <w:b/>
-          </w:rPr>
-          <w:t xml:space="preserve">7. Bibliografía</w:t>
+            <w:noProof/>
+          </w:rPr>
+          <w:t>7. Bibliografía</w:t>
         </w:r>
         <w:r>
           <w:rPr>
@@ -1749,13 +1827,19 @@
             <w:noProof/>
             <w:webHidden/>
           </w:rPr>
+        </w:r>
+        <w:r>
+          <w:rPr>
+            <w:noProof/>
+            <w:webHidden/>
+          </w:rPr>
           <w:fldChar w:fldCharType="separate"/>
         </w:r>
         <w:r>
           <w:rPr>
-            <w:noProof/>
-            <w:webHidden/>
             <w:b/>
+            <w:noProof/>
+            <w:webHidden/>
           </w:rPr>
           <w:t>9</w:t>
         </w:r>
@@ -1781,25 +1865,46 @@
         <w:pStyle w:val="Ttulo11"/>
         <w:keepLines/>
         <w:spacing w:before="240"/>
-      </w:pPr>
-      <w:bookmarkStart w:id="101" w:name="_Toc900101"/>
-      <w:r>
+        <w:rPr>
+          <w:lang w:val="es-CL"/>
+        </w:rPr>
+      </w:pPr>
+      <w:bookmarkStart w:id="0" w:name="_Toc900101"/>
+      <w:r>
+        <w:rPr>
+          <w:lang w:val="es-CL"/>
+        </w:rPr>
+        <w:lastRenderedPageBreak/>
         <w:t>1. Introducción y contextualización</w:t>
       </w:r>
-      <w:bookmarkEnd w:id="101"/>
-    </w:p>
-    <w:p>
-      <w:pPr>
-        <w:spacing w:after="120"/>
+      <w:bookmarkEnd w:id="0"/>
+    </w:p>
+    <w:p>
+      <w:pPr>
         <w:jc w:val="both"/>
       </w:pPr>
       <w:r>
-        <w:t>Este informe integra las cuatro fases del proyecto de análisis de ofertas en licitaciones públicas del sector Salud, de acuerdo con los lineamientos de la Fase 4 del curso (Universidad Andrés Bello, 2026a, 2026b). El trabajo utiliza el reporte de Datos Abiertos de ChileCompra de marzo de 2026, compuesto por 44.226 ofertas y 74 variables (ChileCompra, s. f.). La unidad de observación es una oferta asociada a un ítem; por ello, una misma licitación puede aparecer varias veces. El análisis describe diferencias en la proporción de ofertas ganadoras y en los plazos de cierre, con un flujo reproducible que conserva el archivo original, valida cada transformación y comunica los resultados mediante tres visualizaciones.</w:t>
-      </w:r>
-    </w:p>
-    <w:p>
-      <w:pPr>
-        <w:spacing w:after="120"/>
+        <w:t xml:space="preserve">Este informe integra las cuatro fases del proyecto de análisis de ofertas en licitaciones públicas del sector Salud, de acuerdo con los lineamientos de la Fase 4 del curso (Universidad Andrés Bello, 2026a, 2026b). El trabajo utiliza el reporte de Datos Abiertos de </w:t>
+      </w:r>
+      <w:proofErr w:type="spellStart"/>
+      <w:r>
+        <w:t>ChileCompra</w:t>
+      </w:r>
+      <w:proofErr w:type="spellEnd"/>
+      <w:r>
+        <w:t xml:space="preserve"> de marzo de 2026, compuesto por 44.226 ofertas y 74 variables (</w:t>
+      </w:r>
+      <w:proofErr w:type="spellStart"/>
+      <w:r>
+        <w:t>ChileCompra</w:t>
+      </w:r>
+      <w:proofErr w:type="spellEnd"/>
+      <w:r>
+        <w:t>, s. f.). La unidad de observación es una oferta asociada a un ítem; por ello, una misma licitación puede aparecer varias veces. El análisis describe diferencias en la proporción de ofertas ganadoras y en los plazos de cierre, con un flujo reproducible que conserva el archivo original, valida cada transformación y comunica los resultados mediante tres visualizaciones.</w:t>
+      </w:r>
+    </w:p>
+    <w:p>
+      <w:pPr>
         <w:jc w:val="both"/>
       </w:pPr>
       <w:r>
@@ -1811,16 +1916,21 @@
         <w:pStyle w:val="Ttulo11"/>
         <w:keepLines/>
         <w:spacing w:before="240"/>
-      </w:pPr>
-      <w:bookmarkStart w:id="102" w:name="_Toc900102"/>
-      <w:r>
+        <w:rPr>
+          <w:lang w:val="es-CL"/>
+        </w:rPr>
+      </w:pPr>
+      <w:bookmarkStart w:id="1" w:name="_Toc900102"/>
+      <w:r>
+        <w:rPr>
+          <w:lang w:val="es-CL"/>
+        </w:rPr>
         <w:t>2. Problema, objetivos e hipótesis</w:t>
       </w:r>
-      <w:bookmarkEnd w:id="102"/>
-    </w:p>
-    <w:p>
-      <w:pPr>
-        <w:spacing w:after="120"/>
+      <w:bookmarkEnd w:id="1"/>
+    </w:p>
+    <w:p>
+      <w:pPr>
         <w:jc w:val="both"/>
       </w:pPr>
       <w:r>
@@ -1835,7 +1945,6 @@
     </w:p>
     <w:p>
       <w:pPr>
-        <w:spacing w:after="120"/>
         <w:jc w:val="both"/>
       </w:pPr>
       <w:r>
@@ -1850,7 +1959,6 @@
     </w:p>
     <w:p>
       <w:pPr>
-        <w:spacing w:after="120"/>
         <w:jc w:val="both"/>
       </w:pPr>
       <w:r>
@@ -1865,7 +1973,6 @@
     </w:p>
     <w:p>
       <w:pPr>
-        <w:spacing w:after="120"/>
         <w:jc w:val="both"/>
       </w:pPr>
       <w:r>
@@ -1880,7 +1987,6 @@
     </w:p>
     <w:p>
       <w:pPr>
-        <w:spacing w:after="120"/>
         <w:jc w:val="both"/>
       </w:pPr>
       <w:r>
@@ -1890,7 +1996,15 @@
         <w:t>Alcance y supuestos.</w:t>
       </w:r>
       <w:r>
-        <w:t xml:space="preserve"> El análisis es descriptivo, cubre un mes y un sector, y no demuestra causalidad. Se supone que las etiquetas de resultado y tipo de licitación reflejan el registro administrativo; las fechas del año 1900, usadas como valor de relleno en el registro, no se interpretan como fechas reales; y la categoría NoClasificado se conserva para no asignar un tamaño empresarial sin evidencia.</w:t>
+        <w:t xml:space="preserve"> El análisis es descriptivo, cubre un mes y un sector, y no demuestra causalidad. Se supone que las etiquetas de resultado y tipo de licitación reflejan el registro administrativo; las fechas del año 1900, usadas como valor de relleno en el registro, no se interpretan como fechas reales; y la categoría </w:t>
+      </w:r>
+      <w:proofErr w:type="spellStart"/>
+      <w:r>
+        <w:t>NoClasificado</w:t>
+      </w:r>
+      <w:proofErr w:type="spellEnd"/>
+      <w:r>
+        <w:t xml:space="preserve"> se conserva para no asignar un tamaño empresarial sin evidencia.</w:t>
       </w:r>
     </w:p>
     <w:p>
@@ -1898,28 +2012,39 @@
         <w:pStyle w:val="Ttulo11"/>
         <w:keepLines/>
         <w:spacing w:before="240"/>
-      </w:pPr>
-      <w:bookmarkStart w:id="103" w:name="_Toc900103"/>
-      <w:r>
+        <w:rPr>
+          <w:lang w:val="es-CL"/>
+        </w:rPr>
+      </w:pPr>
+      <w:bookmarkStart w:id="2" w:name="_Toc900103"/>
+      <w:r>
+        <w:rPr>
+          <w:lang w:val="es-CL"/>
+        </w:rPr>
         <w:t>3. Metodología del desarrollo técnico</w:t>
       </w:r>
-      <w:bookmarkEnd w:id="103"/>
+      <w:bookmarkEnd w:id="2"/>
     </w:p>
     <w:p>
       <w:pPr>
         <w:pStyle w:val="Ttulo21"/>
         <w:keepLines/>
         <w:spacing w:before="160"/>
-      </w:pPr>
-      <w:bookmarkStart w:id="104" w:name="_Toc900104"/>
-      <w:r>
+        <w:rPr>
+          <w:lang w:val="es-CL"/>
+        </w:rPr>
+      </w:pPr>
+      <w:bookmarkStart w:id="3" w:name="_Toc900104"/>
+      <w:r>
+        <w:rPr>
+          <w:lang w:val="es-CL"/>
+        </w:rPr>
         <w:t>3.1 Integración de las fases F1-F4</w:t>
       </w:r>
-      <w:bookmarkEnd w:id="104"/>
-    </w:p>
-    <w:p>
-      <w:pPr>
-        <w:spacing w:after="120"/>
+      <w:bookmarkEnd w:id="3"/>
+    </w:p>
+    <w:p>
+      <w:pPr>
         <w:jc w:val="both"/>
       </w:pPr>
       <w:r>
@@ -1930,12 +2055,17 @@
       <w:pPr>
         <w:pStyle w:val="Descripcin1"/>
         <w:keepNext/>
-        <w:spacing w:after="0" w:before="120"/>
+        <w:spacing w:before="120" w:after="0"/>
+        <w:rPr>
+          <w:lang w:val="es-CL"/>
+        </w:rPr>
       </w:pPr>
       <w:r>
         <w:rPr>
           <w:b/>
-        </w:rPr>
+          <w:lang w:val="es-CL"/>
+        </w:rPr>
+        <w:lastRenderedPageBreak/>
         <w:t>Tabla 1</w:t>
       </w:r>
     </w:p>
@@ -1944,10 +2074,14 @@
         <w:pStyle w:val="Descripcin1"/>
         <w:keepNext/>
         <w:spacing w:after="80"/>
+        <w:rPr>
+          <w:lang w:val="es-CL"/>
+        </w:rPr>
       </w:pPr>
       <w:r>
         <w:rPr>
           <w:i/>
+          <w:lang w:val="es-CL"/>
         </w:rPr>
         <w:t>Síntesis metodológica de las fases del proyecto</w:t>
       </w:r>
@@ -1957,7 +2091,7 @@
         <w:tblStyle w:val="Tablaconcuadrcula1clara-nfasis1"/>
         <w:tblW w:w="9936" w:type="dxa"/>
         <w:tblLayout w:type="fixed"/>
-        <w:tblLook w:firstColumn="0" w:firstRow="1" w:lastColumn="0" w:lastRow="0" w:noHBand="0" w:noVBand="1" w:val="04A0"/>
+        <w:tblLook w:val="0420" w:firstRow="1" w:lastRow="0" w:firstColumn="0" w:lastColumn="0" w:noHBand="0" w:noVBand="1"/>
       </w:tblPr>
       <w:tblGrid>
         <w:gridCol w:w="795"/>
@@ -1966,6 +2100,7 @@
       </w:tblGrid>
       <w:tr>
         <w:trPr>
+          <w:cnfStyle w:val="100000000000" w:firstRow="1" w:lastRow="0" w:firstColumn="0" w:lastColumn="0" w:oddVBand="0" w:evenVBand="0" w:oddHBand="0" w:evenHBand="0" w:firstRowFirstColumn="0" w:firstRowLastColumn="0" w:lastRowFirstColumn="0" w:lastRowLastColumn="0"/>
           <w:tblHeader/>
         </w:trPr>
         <w:tc>
@@ -1982,9 +2117,7 @@
             </w:pPr>
             <w:r>
               <w:rPr>
-                <w:b/>
                 <w:color w:val="FFFFFF"/>
-                <w:sz w:val="22"/>
               </w:rPr>
               <w:t>Fase</w:t>
             </w:r>
@@ -2004,9 +2137,7 @@
             </w:pPr>
             <w:r>
               <w:rPr>
-                <w:b/>
                 <w:color w:val="FFFFFF"/>
-                <w:sz w:val="22"/>
               </w:rPr>
               <w:t>Trabajo realizado</w:t>
             </w:r>
@@ -2026,9 +2157,7 @@
             </w:pPr>
             <w:r>
               <w:rPr>
-                <w:b/>
                 <w:color w:val="FFFFFF"/>
-                <w:sz w:val="22"/>
               </w:rPr>
               <w:t>Evidencia principal</w:t>
             </w:r>
@@ -2051,9 +2180,6 @@
               <w:jc w:val="center"/>
             </w:pPr>
             <w:r>
-              <w:rPr>
-                <w:sz w:val="22"/>
-              </w:rPr>
               <w:t>F1</w:t>
             </w:r>
           </w:p>
@@ -2067,12 +2193,8 @@
             <w:pPr>
               <w:keepNext/>
               <w:spacing w:before="40" w:after="40" w:line="240" w:lineRule="auto"/>
-              <w:jc w:val="left"/>
             </w:pPr>
             <w:r>
-              <w:rPr>
-                <w:sz w:val="22"/>
-              </w:rPr>
               <w:t>Definición del problema, unidad de análisis, fuente y entorno reproducible.</w:t>
             </w:r>
           </w:p>
@@ -2086,12 +2208,8 @@
             <w:pPr>
               <w:keepNext/>
               <w:spacing w:before="40" w:after="40" w:line="240" w:lineRule="auto"/>
-              <w:jc w:val="left"/>
             </w:pPr>
             <w:r>
-              <w:rPr>
-                <w:sz w:val="22"/>
-              </w:rPr>
               <w:t>F1_Definición.ipynb</w:t>
             </w:r>
           </w:p>
@@ -2114,9 +2232,6 @@
               <w:jc w:val="center"/>
             </w:pPr>
             <w:r>
-              <w:rPr>
-                <w:sz w:val="22"/>
-              </w:rPr>
               <w:t>F2</w:t>
             </w:r>
           </w:p>
@@ -2131,12 +2246,8 @@
             <w:pPr>
               <w:keepNext/>
               <w:spacing w:before="40" w:after="40" w:line="240" w:lineRule="auto"/>
-              <w:jc w:val="left"/>
             </w:pPr>
             <w:r>
-              <w:rPr>
-                <w:sz w:val="22"/>
-              </w:rPr>
               <w:t>Exploración de 74 variables; limpieza, fechas, categorías, variables derivadas y validación.</w:t>
             </w:r>
           </w:p>
@@ -2151,12 +2262,8 @@
             <w:pPr>
               <w:keepNext/>
               <w:spacing w:before="40" w:after="40" w:line="240" w:lineRule="auto"/>
-              <w:jc w:val="left"/>
             </w:pPr>
             <w:r>
-              <w:rPr>
-                <w:sz w:val="22"/>
-              </w:rPr>
               <w:t>F2_Preprocesamiento.ipynb</w:t>
             </w:r>
           </w:p>
@@ -2178,9 +2285,6 @@
               <w:jc w:val="center"/>
             </w:pPr>
             <w:r>
-              <w:rPr>
-                <w:sz w:val="22"/>
-              </w:rPr>
               <w:t>F3</w:t>
             </w:r>
           </w:p>
@@ -2194,12 +2298,8 @@
             <w:pPr>
               <w:keepNext/>
               <w:spacing w:before="40" w:after="40" w:line="240" w:lineRule="auto"/>
-              <w:jc w:val="left"/>
             </w:pPr>
             <w:r>
-              <w:rPr>
-                <w:sz w:val="22"/>
-              </w:rPr>
               <w:t>Separación modular, POO, cuatro algoritmos equivalentes, pruebas y mediciones.</w:t>
             </w:r>
           </w:p>
@@ -2213,19 +2313,9 @@
             <w:pPr>
               <w:keepNext/>
               <w:spacing w:before="40" w:after="40" w:line="240" w:lineRule="auto"/>
-              <w:jc w:val="left"/>
             </w:pPr>
             <w:r>
-              <w:rPr>
-                <w:sz w:val="22"/>
-              </w:rPr>
-              <w:t>F3_Algoritmos.ipynb</w:t>
-            </w:r>
-            <w:r>
-              <w:rPr>
-                <w:sz w:val="22"/>
-              </w:rPr>
-              <w:t>, 29 pruebas</w:t>
+              <w:t>F3_Algoritmos.ipynb, 29 pruebas</w:t>
             </w:r>
           </w:p>
         </w:tc>
@@ -2247,9 +2337,6 @@
               <w:jc w:val="center"/>
             </w:pPr>
             <w:r>
-              <w:rPr>
-                <w:sz w:val="22"/>
-              </w:rPr>
               <w:t>F4</w:t>
             </w:r>
           </w:p>
@@ -2264,12 +2351,8 @@
             <w:pPr>
               <w:keepNext/>
               <w:spacing w:before="40" w:after="40" w:line="240" w:lineRule="auto"/>
-              <w:jc w:val="left"/>
             </w:pPr>
             <w:r>
-              <w:rPr>
-                <w:sz w:val="22"/>
-              </w:rPr>
               <w:t>Reutilización del flujo validado, tres gráficos, interpretación y comunicación final.</w:t>
             </w:r>
           </w:p>
@@ -2284,19 +2367,9 @@
             <w:pPr>
               <w:keepNext/>
               <w:spacing w:before="40" w:after="40" w:line="240" w:lineRule="auto"/>
-              <w:jc w:val="left"/>
             </w:pPr>
             <w:r>
-              <w:rPr>
-                <w:sz w:val="22"/>
-              </w:rPr>
-              <w:t>F4_Comunicacion.ipynb</w:t>
-            </w:r>
-            <w:r>
-              <w:rPr>
-                <w:sz w:val="22"/>
-              </w:rPr>
-              <w:t>, 10 pruebas</w:t>
+              <w:t>F4_Comunicacion.ipynb, 10 pruebas</w:t>
             </w:r>
           </w:p>
         </w:tc>
@@ -2307,51 +2380,58 @@
         <w:pStyle w:val="Descripcin1"/>
         <w:spacing w:before="60" w:after="200"/>
         <w:jc w:val="both"/>
+        <w:rPr>
+          <w:lang w:val="es-CL"/>
+        </w:rPr>
       </w:pPr>
       <w:r>
         <w:rPr>
           <w:i/>
-          <w:sz w:val="22"/>
+          <w:lang w:val="es-CL"/>
         </w:rPr>
         <w:t xml:space="preserve">Nota. </w:t>
       </w:r>
       <w:r>
         <w:rPr>
-          <w:sz w:val="22"/>
+          <w:lang w:val="es-CL"/>
         </w:rPr>
         <w:t>Elaboración propia a partir de los notebooks y verificadores del repositorio.</w:t>
       </w:r>
     </w:p>
     <w:p>
       <w:pPr>
-        <w:spacing w:after="120"/>
         <w:jc w:val="both"/>
       </w:pPr>
       <w:r>
         <w:t xml:space="preserve">En F2 se eliminaron únicamente tres columnas completamente vacías; 7.613 valores del año 1900 en la fecha estimada de evaluación se convirtieron en valores ausentes; se normalizaron espacios en categorías; y se calcularon </w:t>
       </w:r>
+      <w:proofErr w:type="spellStart"/>
       <w:r>
         <w:t>oferta_ganadora</w:t>
       </w:r>
+      <w:proofErr w:type="spellEnd"/>
       <w:r>
         <w:t xml:space="preserve">, </w:t>
       </w:r>
+      <w:proofErr w:type="spellStart"/>
       <w:r>
         <w:t>licitacion_adjudicada</w:t>
       </w:r>
+      <w:proofErr w:type="spellEnd"/>
       <w:r>
         <w:t xml:space="preserve"> y </w:t>
       </w:r>
+      <w:proofErr w:type="spellStart"/>
       <w:r>
         <w:t>plazo_cierre_dias</w:t>
       </w:r>
+      <w:proofErr w:type="spellEnd"/>
       <w:r>
         <w:t>, siguiendo las prácticas de preparación de datos con pandas descritas por McKinney (2022). No se imputaron los faltantes parciales, porque las variables del análisis estaban completas, ni se escalaron variables, porque no se entrenó un modelo que lo requiriera. Las 44.226 filas se conservaron.</w:t>
       </w:r>
     </w:p>
     <w:p>
       <w:pPr>
-        <w:spacing w:after="120"/>
         <w:jc w:val="both"/>
       </w:pPr>
       <w:r>
@@ -2365,15 +2445,24 @@
           <w:left w:val="single" w:sz="12" w:space="6" w:color="1F497D"/>
         </w:pBdr>
         <w:shd w:val="clear" w:color="auto" w:fill="F2F5F8"/>
-        <w:spacing w:after="0" w:before="0" w:line="240" w:lineRule="auto"/>
+        <w:spacing w:after="0" w:line="240" w:lineRule="auto"/>
         <w:ind w:left="280" w:right="120"/>
       </w:pPr>
       <w:r>
-        <w:rPr>
-          <w:color w:val="111827"/>
-          <w:sz w:val="22"/>
-        </w:rPr>
-        <w:t>lector = LectorCSV(contrato, columnas=COLUMNAS_ANALISIS, tipos=TIPOS_ANALISIS)</w:t>
+        <w:t xml:space="preserve">lector = </w:t>
+      </w:r>
+      <w:proofErr w:type="spellStart"/>
+      <w:proofErr w:type="gramStart"/>
+      <w:r>
+        <w:t>LectorCSV</w:t>
+      </w:r>
+      <w:proofErr w:type="spellEnd"/>
+      <w:r>
+        <w:t>(</w:t>
+      </w:r>
+      <w:proofErr w:type="gramEnd"/>
+      <w:r>
+        <w:t>contrato, columnas=COLUMNAS_ANALISIS, tipos=TIPOS_ANALISIS)</w:t>
       </w:r>
     </w:p>
     <w:p>
@@ -2383,15 +2472,29 @@
           <w:left w:val="single" w:sz="12" w:space="6" w:color="1F497D"/>
         </w:pBdr>
         <w:shd w:val="clear" w:color="auto" w:fill="F2F5F8"/>
-        <w:spacing w:after="0" w:before="0" w:line="240" w:lineRule="auto"/>
+        <w:spacing w:after="0" w:line="240" w:lineRule="auto"/>
         <w:ind w:left="280" w:right="120"/>
       </w:pPr>
       <w:r>
-        <w:rPr>
-          <w:color w:val="111827"/>
-          <w:sz w:val="22"/>
-        </w:rPr>
-        <w:t>raw = lector.leer(ruta)                                 # valida el contrato de columnas</w:t>
+        <w:t xml:space="preserve">raw = </w:t>
+      </w:r>
+      <w:proofErr w:type="spellStart"/>
+      <w:proofErr w:type="gramStart"/>
+      <w:r>
+        <w:t>lector.leer</w:t>
+      </w:r>
+      <w:proofErr w:type="spellEnd"/>
+      <w:proofErr w:type="gramEnd"/>
+      <w:r>
+        <w:t>(</w:t>
+      </w:r>
+      <w:proofErr w:type="gramStart"/>
+      <w:r>
+        <w:t xml:space="preserve">ruta)   </w:t>
+      </w:r>
+      <w:proofErr w:type="gramEnd"/>
+      <w:r>
+        <w:t xml:space="preserve">                              # valida el contrato de columnas</w:t>
       </w:r>
     </w:p>
     <w:p>
@@ -2401,15 +2504,35 @@
           <w:left w:val="single" w:sz="12" w:space="6" w:color="1F497D"/>
         </w:pBdr>
         <w:shd w:val="clear" w:color="auto" w:fill="F2F5F8"/>
-        <w:spacing w:after="0" w:before="0" w:line="240" w:lineRule="auto"/>
+        <w:spacing w:after="0" w:line="240" w:lineRule="auto"/>
         <w:ind w:left="280" w:right="120"/>
       </w:pPr>
       <w:r>
-        <w:rPr>
-          <w:color w:val="111827"/>
-          <w:sz w:val="22"/>
-        </w:rPr>
-        <w:t>datos = LimpiadorLicitaciones().limpiar(raw)            # no modifica la entrada</w:t>
+        <w:t xml:space="preserve">datos = </w:t>
+      </w:r>
+      <w:proofErr w:type="spellStart"/>
+      <w:r>
+        <w:t>LimpiadorLicitaciones</w:t>
+      </w:r>
+      <w:proofErr w:type="spellEnd"/>
+      <w:r>
+        <w:t>(</w:t>
+      </w:r>
+      <w:proofErr w:type="gramStart"/>
+      <w:r>
+        <w:t>).limpiar</w:t>
+      </w:r>
+      <w:proofErr w:type="gramEnd"/>
+      <w:r>
+        <w:t>(</w:t>
+      </w:r>
+      <w:proofErr w:type="gramStart"/>
+      <w:r>
+        <w:t xml:space="preserve">raw)   </w:t>
+      </w:r>
+      <w:proofErr w:type="gramEnd"/>
+      <w:r>
+        <w:t xml:space="preserve">         # no modifica la entrada</w:t>
       </w:r>
     </w:p>
     <w:p>
@@ -2419,15 +2542,37 @@
           <w:left w:val="single" w:sz="12" w:space="6" w:color="1F497D"/>
         </w:pBdr>
         <w:shd w:val="clear" w:color="auto" w:fill="F2F5F8"/>
-        <w:spacing w:after="0" w:before="0" w:line="240" w:lineRule="auto"/>
+        <w:spacing w:after="0" w:line="240" w:lineRule="auto"/>
         <w:ind w:left="280" w:right="120"/>
       </w:pPr>
-      <w:r>
-        <w:rPr>
-          <w:color w:val="111827"/>
-          <w:sz w:val="22"/>
-        </w:rPr>
-        <w:t>ValidadorDatasetProcesado().validar(datos, len(raw))    # seis reglas de calidad</w:t>
+      <w:proofErr w:type="spellStart"/>
+      <w:proofErr w:type="gramStart"/>
+      <w:r>
+        <w:t>ValidadorDatasetProcesado</w:t>
+      </w:r>
+      <w:proofErr w:type="spellEnd"/>
+      <w:r>
+        <w:t>().validar</w:t>
+      </w:r>
+      <w:proofErr w:type="gramEnd"/>
+      <w:r>
+        <w:t xml:space="preserve">(datos, </w:t>
+      </w:r>
+      <w:proofErr w:type="spellStart"/>
+      <w:r>
+        <w:t>len</w:t>
+      </w:r>
+      <w:proofErr w:type="spellEnd"/>
+      <w:r>
+        <w:t>(raw</w:t>
+      </w:r>
+      <w:proofErr w:type="gramStart"/>
+      <w:r>
+        <w:t xml:space="preserve">))   </w:t>
+      </w:r>
+      <w:proofErr w:type="gramEnd"/>
+      <w:r>
+        <w:t xml:space="preserve"> # seis reglas de calidad</w:t>
       </w:r>
     </w:p>
     <w:p>
@@ -2437,38 +2582,102 @@
           <w:left w:val="single" w:sz="12" w:space="6" w:color="1F497D"/>
         </w:pBdr>
         <w:shd w:val="clear" w:color="auto" w:fill="F2F5F8"/>
-        <w:spacing w:after="0" w:before="0" w:line="240" w:lineRule="auto"/>
+        <w:spacing w:after="0" w:line="240" w:lineRule="auto"/>
         <w:ind w:left="280" w:right="120"/>
       </w:pPr>
       <w:r>
-        <w:rPr>
-          <w:color w:val="111827"/>
-          <w:sz w:val="22"/>
-        </w:rPr>
-        <w:t>tabla = tabla_proporciones_agrupada(datos, "TamanoProveedor")</w:t>
-      </w:r>
-    </w:p>
-    <w:p>
-      <w:pPr>
-        <w:keepNext w:val="0"/>
+        <w:t xml:space="preserve">tabla = </w:t>
+      </w:r>
+      <w:proofErr w:type="spellStart"/>
+      <w:r>
+        <w:t>tabla_proporciones_</w:t>
+      </w:r>
+      <w:proofErr w:type="gramStart"/>
+      <w:r>
+        <w:t>agrupada</w:t>
+      </w:r>
+      <w:proofErr w:type="spellEnd"/>
+      <w:r>
+        <w:t>(</w:t>
+      </w:r>
+      <w:proofErr w:type="gramEnd"/>
+      <w:r>
+        <w:t>datos, "</w:t>
+      </w:r>
+      <w:proofErr w:type="spellStart"/>
+      <w:r>
+        <w:t>TamanoProveedor</w:t>
+      </w:r>
+      <w:proofErr w:type="spellEnd"/>
+      <w:r>
+        <w:t>")</w:t>
+      </w:r>
+    </w:p>
+    <w:p>
+      <w:pPr>
         <w:pBdr>
           <w:left w:val="single" w:sz="12" w:space="6" w:color="1F497D"/>
         </w:pBdr>
         <w:shd w:val="clear" w:color="auto" w:fill="F2F5F8"/>
-        <w:spacing w:after="160" w:before="0" w:line="240" w:lineRule="auto"/>
+        <w:spacing w:after="160" w:line="240" w:lineRule="auto"/>
         <w:ind w:left="280" w:right="120"/>
       </w:pPr>
-      <w:r>
-        <w:rPr>
-          <w:color w:val="111827"/>
-          <w:sz w:val="22"/>
-        </w:rPr>
-        <w:t>pd.testing.assert_frame_equal(tabla, tabla_proporciones(datos, "TamanoProveedor"))</w:t>
-      </w:r>
-    </w:p>
-    <w:p>
-      <w:pPr>
-        <w:spacing w:after="120"/>
+      <w:proofErr w:type="spellStart"/>
+      <w:proofErr w:type="gramStart"/>
+      <w:r>
+        <w:t>pd.testing</w:t>
+      </w:r>
+      <w:proofErr w:type="gramEnd"/>
+      <w:r>
+        <w:t>.assert_</w:t>
+      </w:r>
+      <w:proofErr w:type="gramStart"/>
+      <w:r>
+        <w:t>frame</w:t>
+      </w:r>
+      <w:proofErr w:type="gramEnd"/>
+      <w:r>
+        <w:t>_</w:t>
+      </w:r>
+      <w:proofErr w:type="gramStart"/>
+      <w:r>
+        <w:t>equal</w:t>
+      </w:r>
+      <w:proofErr w:type="spellEnd"/>
+      <w:r>
+        <w:t>(</w:t>
+      </w:r>
+      <w:proofErr w:type="gramEnd"/>
+      <w:r>
+        <w:t xml:space="preserve">tabla, </w:t>
+      </w:r>
+      <w:proofErr w:type="spellStart"/>
+      <w:r>
+        <w:t>tabla_</w:t>
+      </w:r>
+      <w:proofErr w:type="gramStart"/>
+      <w:r>
+        <w:t>proporciones</w:t>
+      </w:r>
+      <w:proofErr w:type="spellEnd"/>
+      <w:r>
+        <w:t>(</w:t>
+      </w:r>
+      <w:proofErr w:type="gramEnd"/>
+      <w:r>
+        <w:t>datos, "</w:t>
+      </w:r>
+      <w:proofErr w:type="spellStart"/>
+      <w:r>
+        <w:t>TamanoProveedor</w:t>
+      </w:r>
+      <w:proofErr w:type="spellEnd"/>
+      <w:r>
+        <w:t>"))</w:t>
+      </w:r>
+    </w:p>
+    <w:p>
+      <w:pPr>
         <w:jc w:val="both"/>
       </w:pPr>
       <w:r>
@@ -2480,81 +2689,207 @@
         <w:pStyle w:val="Ttulo21"/>
         <w:keepLines/>
         <w:spacing w:before="160"/>
-      </w:pPr>
-      <w:bookmarkStart w:id="105" w:name="_Toc900105"/>
-      <w:r>
+        <w:rPr>
+          <w:lang w:val="es-CL"/>
+        </w:rPr>
+      </w:pPr>
+      <w:bookmarkStart w:id="4" w:name="_Toc900105"/>
+      <w:r>
+        <w:rPr>
+          <w:lang w:val="es-CL"/>
+        </w:rPr>
         <w:t>3.2 Herramientas, reproducibilidad y control de versiones</w:t>
       </w:r>
-      <w:bookmarkEnd w:id="105"/>
-    </w:p>
-    <w:p>
-      <w:pPr>
-        <w:spacing w:after="120"/>
+      <w:bookmarkEnd w:id="4"/>
+    </w:p>
+    <w:p>
+      <w:pPr>
         <w:jc w:val="both"/>
       </w:pPr>
       <w:r>
-        <w:t xml:space="preserve">El proyecto combina Python, NumPy, pandas, Jupyter, </w:t>
-      </w:r>
+        <w:t xml:space="preserve">El proyecto combina Python, </w:t>
+      </w:r>
+      <w:proofErr w:type="spellStart"/>
+      <w:r>
+        <w:t>NumPy</w:t>
+      </w:r>
+      <w:proofErr w:type="spellEnd"/>
+      <w:r>
+        <w:t xml:space="preserve">, pandas, </w:t>
+      </w:r>
+      <w:proofErr w:type="spellStart"/>
+      <w:r>
+        <w:t>Jupyter</w:t>
+      </w:r>
+      <w:proofErr w:type="spellEnd"/>
+      <w:r>
+        <w:t xml:space="preserve">, </w:t>
+      </w:r>
+      <w:proofErr w:type="spellStart"/>
       <w:r>
         <w:t>unittest</w:t>
       </w:r>
-      <w:r>
-        <w:t xml:space="preserve">, Matplotlib (Hunter, 2007) y Seaborn (Waskom, 2021). El archivo </w:t>
-      </w:r>
-      <w:r>
-        <w:t>requirements.txt</w:t>
-      </w:r>
-      <w:r>
-        <w:t xml:space="preserve"> fija NumPy 2.3.5 y pandas 3.0.1 y declara el resto de las dependencias; el entorno se crea con </w:t>
-      </w:r>
+      <w:proofErr w:type="spellEnd"/>
+      <w:r>
+        <w:t xml:space="preserve">, </w:t>
+      </w:r>
+      <w:proofErr w:type="spellStart"/>
+      <w:r>
+        <w:t>Matplotlib</w:t>
+      </w:r>
+      <w:proofErr w:type="spellEnd"/>
+      <w:r>
+        <w:t xml:space="preserve"> (Hunter, 2007) y Seaborn (Waskom, 2021)</w:t>
+      </w:r>
+      <w:r>
+        <w:t xml:space="preserve"> para el análisis, </w:t>
+      </w:r>
+      <w:r>
+        <w:t>y Git con GitHub para el control de versiones y la colaboración</w:t>
+      </w:r>
+      <w:r>
+        <w:t xml:space="preserve">. El archivo requirements.txt fija </w:t>
+      </w:r>
+      <w:proofErr w:type="spellStart"/>
+      <w:r>
+        <w:t>NumPy</w:t>
+      </w:r>
+      <w:proofErr w:type="spellEnd"/>
+      <w:r>
+        <w:t xml:space="preserve"> 2.3.5 y pandas 3.0.1 y declara el resto de las dependencias; el entorno se crea con </w:t>
+      </w:r>
+      <w:proofErr w:type="spellStart"/>
       <w:r>
         <w:t>venv</w:t>
       </w:r>
-      <w:r>
-        <w:t xml:space="preserve">. Los verificadores ejecutan cada notebook en un kernel nuevo y guardan en </w:t>
-      </w:r>
-      <w:r>
-        <w:t>evidencias/</w:t>
-      </w:r>
-      <w:r>
-        <w:t xml:space="preserve"> la fecha, la versión de Python, el número de celdas, los errores y la huella del notebook, en línea con las recomendaciones de reproducibilidad de Samuel y Mietchen (2024). F1 y F2 se verificaron con Python 3.12.14, F3 con 3.11.15 y F4 con 3.14.7, sin cambios en los resultados. El CSV original permanece versionado y los derivados reproducibles quedan fuera de Git para no duplicar archivos grandes.</w:t>
-      </w:r>
-    </w:p>
-    <w:p>
-      <w:pPr>
-        <w:spacing w:after="120"/>
+      <w:proofErr w:type="spellEnd"/>
+      <w:r>
+        <w:t xml:space="preserve">. Los verificadores ejecutan cada notebook en un </w:t>
+      </w:r>
+      <w:proofErr w:type="spellStart"/>
+      <w:r>
+        <w:t>kernel</w:t>
+      </w:r>
+      <w:proofErr w:type="spellEnd"/>
+      <w:r>
+        <w:t xml:space="preserve"> nuevo y guardan en evidencias/ la fecha, la versión de Python, el número de celdas, los errores y la huella del notebook, en línea con las recomendaciones de reproducibilidad de Samuel y </w:t>
+      </w:r>
+      <w:proofErr w:type="spellStart"/>
+      <w:r>
+        <w:t>Mietchen</w:t>
+      </w:r>
+      <w:proofErr w:type="spellEnd"/>
+      <w:r>
+        <w:t xml:space="preserve"> (2024). F1 y F2 se verificaron con Python 3.12.14, F3 con 3.11.15 y F4 con 3.14.7, sin cambios en los resultados. El CSV original permanece versionado y los derivados reproducibles quedan fuera de Git para no duplicar archivos grandes.</w:t>
+      </w:r>
+    </w:p>
+    <w:p>
+      <w:pPr>
         <w:jc w:val="both"/>
       </w:pPr>
       <w:r>
-        <w:t xml:space="preserve">El repositorio tiene una carpeta por fase (F1 a F4), el código común en </w:t>
-      </w:r>
-      <w:r>
-        <w:t>src/</w:t>
-      </w:r>
-      <w:r>
-        <w:t xml:space="preserve"> y un README con instrucciones de instalación y ejecución. El trabajo se integra en la rama </w:t>
-      </w:r>
-      <w:r>
-        <w:t>desarrollo</w:t>
-      </w:r>
-      <w:r>
-        <w:t xml:space="preserve"> y pasa a </w:t>
-      </w:r>
+        <w:t xml:space="preserve">El control de versiones se gestionó con Git y el repositorio se aloja en GitHub (github.com/vbravo29/mcdi500-licitaciones-salud). El repositorio tiene una carpeta por fase (F1 a F4), el código común en </w:t>
+      </w:r>
+      <w:proofErr w:type="spellStart"/>
+      <w:r>
+        <w:t>src</w:t>
+      </w:r>
+      <w:proofErr w:type="spellEnd"/>
+      <w:r>
+        <w:t>/ y un README</w:t>
+      </w:r>
+      <w:r>
+        <w:t xml:space="preserve"> con instrucciones de instalación y ejecución. </w:t>
+      </w:r>
+      <w:r>
+        <w:t xml:space="preserve">El trabajo se </w:t>
+      </w:r>
+      <w:r>
+        <w:lastRenderedPageBreak/>
+        <w:t xml:space="preserve">integra en la rama desarrollo y pasa a </w:t>
+      </w:r>
+      <w:proofErr w:type="spellStart"/>
       <w:r>
         <w:t>main</w:t>
       </w:r>
-      <w:r>
-        <w:t xml:space="preserve"> mediante pull request. El historial supera los 60 commits y registra aportes de los tres integrantes: Mauricio Cid en la lectura configurable y sus mediciones; Nayadeth Garrido en el núcleo POO de limpieza y validación y en los informes; y Víctor Bravo en los algoritmos, las mediciones y las visualizaciones. El archivo </w:t>
-      </w:r>
-      <w:r>
-        <w:t>.mailmap</w:t>
-      </w:r>
+      <w:proofErr w:type="spellEnd"/>
+      <w:r>
+        <w:t xml:space="preserve"> mediante </w:t>
+      </w:r>
+      <w:proofErr w:type="spellStart"/>
+      <w:r>
+        <w:t>pull</w:t>
+      </w:r>
+      <w:proofErr w:type="spellEnd"/>
+      <w:r>
+        <w:t xml:space="preserve"> </w:t>
+      </w:r>
+      <w:proofErr w:type="spellStart"/>
+      <w:r>
+        <w:t>request</w:t>
+      </w:r>
+      <w:proofErr w:type="spellEnd"/>
+      <w:r>
+        <w:t xml:space="preserve"> en GitHub, lo que deja un registro revisable de cada integración. El archivo docs/changelog.md vincula cada mejora con su </w:t>
+      </w:r>
+      <w:proofErr w:type="spellStart"/>
+      <w:r>
+        <w:t>commit</w:t>
+      </w:r>
+      <w:proofErr w:type="spellEnd"/>
+      <w:r>
+        <w:t xml:space="preserve">. El historial supera los 60 </w:t>
+      </w:r>
+      <w:proofErr w:type="spellStart"/>
+      <w:r>
+        <w:t>commits</w:t>
+      </w:r>
+      <w:proofErr w:type="spellEnd"/>
+      <w:r>
+        <w:t xml:space="preserve"> y registra aportes de los tres integrantes: Mauricio Cid en la lectura configurable y sus mediciones; </w:t>
+      </w:r>
+      <w:proofErr w:type="spellStart"/>
+      <w:r>
+        <w:t>Nayadeth</w:t>
+      </w:r>
+      <w:proofErr w:type="spellEnd"/>
+      <w:r>
+        <w:t xml:space="preserve"> Garrido en el núcleo POO de limpieza y validación y en los informes; y Víctor Bravo en los algoritmos, las mediciones y las visualizaciones. El </w:t>
+      </w:r>
+      <w:proofErr w:type="gramStart"/>
+      <w:r>
+        <w:t>archivo .</w:t>
+      </w:r>
+      <w:proofErr w:type="spellStart"/>
+      <w:r>
+        <w:t>mailmap</w:t>
+      </w:r>
+      <w:proofErr w:type="spellEnd"/>
+      <w:proofErr w:type="gramEnd"/>
       <w:r>
         <w:t xml:space="preserve"> consolida las identidades y </w:t>
       </w:r>
-      <w:r>
-        <w:t>git shortlog -sn</w:t>
-      </w:r>
+      <w:proofErr w:type="spellStart"/>
+      <w:r>
+        <w:t>git</w:t>
+      </w:r>
+      <w:proofErr w:type="spellEnd"/>
+      <w:r>
+        <w:t xml:space="preserve"> </w:t>
+      </w:r>
+      <w:proofErr w:type="spellStart"/>
+      <w:r>
+        <w:t>shortlog</w:t>
+      </w:r>
+      <w:proofErr w:type="spellEnd"/>
+      <w:r>
+        <w:t xml:space="preserve"> -</w:t>
+      </w:r>
+      <w:proofErr w:type="spellStart"/>
+      <w:r>
+        <w:t>sn</w:t>
+      </w:r>
+      <w:proofErr w:type="spellEnd"/>
       <w:r>
         <w:t xml:space="preserve"> muestra los aportes por integrante.</w:t>
       </w:r>
@@ -2564,31 +2899,77 @@
         <w:pStyle w:val="Ttulo21"/>
         <w:keepLines/>
         <w:spacing w:before="160"/>
-      </w:pPr>
-      <w:bookmarkStart w:id="106" w:name="_Toc900106"/>
-      <w:r>
+        <w:rPr>
+          <w:lang w:val="es-CL"/>
+        </w:rPr>
+      </w:pPr>
+      <w:bookmarkStart w:id="5" w:name="_Toc900106"/>
+      <w:r>
+        <w:rPr>
+          <w:lang w:val="es-CL"/>
+        </w:rPr>
         <w:t>3.3 Eficiencia, validación y programación orientada a objetos</w:t>
       </w:r>
-      <w:bookmarkEnd w:id="106"/>
-    </w:p>
-    <w:p>
-      <w:pPr>
-        <w:spacing w:after="120"/>
+      <w:bookmarkEnd w:id="5"/>
+    </w:p>
+    <w:p>
+      <w:pPr>
         <w:jc w:val="both"/>
       </w:pPr>
       <w:r>
         <w:t xml:space="preserve">Se compararon cuatro implementaciones equivalentes mediante </w:t>
       </w:r>
+      <w:proofErr w:type="spellStart"/>
       <w:r>
         <w:t>timeit</w:t>
       </w:r>
-      <w:r>
-        <w:t>: la referencia F2, una iterativa, una recursiva por división y conquista (Cormen et al., 2022) y una agrupada con pandas. Las pruebas usaron muestras de 100, 1.000, 10.000 y 44.226 filas, siete rondas de tres ejecuciones y orden alternado. En el conjunto completo, la variante agrupada alcanzó medianas de 19,02 ms por tamaño de proveedor y 20,96 ms por tipo de licitación, aproximadamente 1,16 veces más rápida que la referencia. El cambio más importante fue leer solo siete de 74 columnas: el flujo completo bajó de 1.199 a 506 ms y el DataFrame leído de 195,7 a 8,9 MiB. Estas cifras corresponden al equipo y a las versiones registradas, y no se pueden generalizar a otros entornos (Python Software Foundation, s. f.-a, s. f.-b; The pandas development team, s. f.-a, s. f.-b).</w:t>
-      </w:r>
-    </w:p>
-    <w:p>
-      <w:pPr>
-        <w:spacing w:after="120"/>
+      <w:proofErr w:type="spellEnd"/>
+      <w:r>
+        <w:t>: la referencia F2, una iterativa, una recursiva por división y conquista (</w:t>
+      </w:r>
+      <w:proofErr w:type="spellStart"/>
+      <w:r>
+        <w:t>Cormen</w:t>
+      </w:r>
+      <w:proofErr w:type="spellEnd"/>
+      <w:r>
+        <w:t xml:space="preserve"> et al., 2022) y una agrupada con pandas. Las pruebas usaron muestras de 100, 1.000, 10.000 y 44.226 filas, siete rondas de tres ejecuciones y orden alternado. En el conjunto completo, la variante agrupada alcanzó medianas de 19,02 ms por tamaño de proveedor y 20,96 ms por tipo de licitación, aproximadamente 1,16 veces más rápida que la referencia. El cambio más importante fue leer solo siete de 74 columnas: el flujo completo bajó de 1.199 a 506 ms y el </w:t>
+      </w:r>
+      <w:proofErr w:type="spellStart"/>
+      <w:r>
+        <w:t>DataFrame</w:t>
+      </w:r>
+      <w:proofErr w:type="spellEnd"/>
+      <w:r>
+        <w:t xml:space="preserve"> leído de 195,7 a 8,9 MiB. Estas cifras corresponden al equipo y a las versiones registradas, y no se pueden generalizar a otros entornos (Python Software </w:t>
+      </w:r>
+      <w:proofErr w:type="spellStart"/>
+      <w:r>
+        <w:t>Foundation</w:t>
+      </w:r>
+      <w:proofErr w:type="spellEnd"/>
+      <w:r>
+        <w:t xml:space="preserve">, s. f.-a, s. f.-b; The pandas </w:t>
+      </w:r>
+      <w:proofErr w:type="spellStart"/>
+      <w:r>
+        <w:t>development</w:t>
+      </w:r>
+      <w:proofErr w:type="spellEnd"/>
+      <w:r>
+        <w:t xml:space="preserve"> </w:t>
+      </w:r>
+      <w:proofErr w:type="spellStart"/>
+      <w:r>
+        <w:t>team</w:t>
+      </w:r>
+      <w:proofErr w:type="spellEnd"/>
+      <w:r>
+        <w:t>, s. f.-a, s. f.-b).</w:t>
+      </w:r>
+    </w:p>
+    <w:p>
+      <w:pPr>
         <w:jc w:val="both"/>
       </w:pPr>
       <w:r>
@@ -2602,15 +2983,48 @@
           <w:left w:val="single" w:sz="12" w:space="6" w:color="1F497D"/>
         </w:pBdr>
         <w:shd w:val="clear" w:color="auto" w:fill="F2F5F8"/>
-        <w:spacing w:after="0" w:before="0" w:line="240" w:lineRule="auto"/>
+        <w:spacing w:after="0" w:line="240" w:lineRule="auto"/>
         <w:ind w:left="280" w:right="120"/>
       </w:pPr>
-      <w:r>
-        <w:rPr>
-          <w:color w:val="111827"/>
-          <w:sz w:val="22"/>
-        </w:rPr>
-        <w:t>def _contar_dividiendo(grupos, codigos, inicio, fin, bloque_base):</w:t>
+      <w:proofErr w:type="spellStart"/>
+      <w:r>
+        <w:t>def</w:t>
+      </w:r>
+      <w:proofErr w:type="spellEnd"/>
+      <w:r>
+        <w:t xml:space="preserve"> _</w:t>
+      </w:r>
+      <w:proofErr w:type="spellStart"/>
+      <w:r>
+        <w:t>contar_</w:t>
+      </w:r>
+      <w:proofErr w:type="gramStart"/>
+      <w:r>
+        <w:t>dividiendo</w:t>
+      </w:r>
+      <w:proofErr w:type="spellEnd"/>
+      <w:r>
+        <w:t>(</w:t>
+      </w:r>
+      <w:proofErr w:type="gramEnd"/>
+      <w:r>
+        <w:t xml:space="preserve">grupos, </w:t>
+      </w:r>
+      <w:proofErr w:type="spellStart"/>
+      <w:r>
+        <w:t>codigos</w:t>
+      </w:r>
+      <w:proofErr w:type="spellEnd"/>
+      <w:r>
+        <w:t xml:space="preserve">, inicio, fin, </w:t>
+      </w:r>
+      <w:proofErr w:type="spellStart"/>
+      <w:r>
+        <w:t>bloque_base</w:t>
+      </w:r>
+      <w:proofErr w:type="spellEnd"/>
+      <w:r>
+        <w:t>):</w:t>
       </w:r>
     </w:p>
     <w:p>
@@ -2620,15 +3034,27 @@
           <w:left w:val="single" w:sz="12" w:space="6" w:color="1F497D"/>
         </w:pBdr>
         <w:shd w:val="clear" w:color="auto" w:fill="F2F5F8"/>
-        <w:spacing w:after="0" w:before="0" w:line="240" w:lineRule="auto"/>
+        <w:spacing w:after="0" w:line="240" w:lineRule="auto"/>
         <w:ind w:left="280" w:right="120"/>
       </w:pPr>
       <w:r>
-        <w:rPr>
-          <w:color w:val="111827"/>
-          <w:sz w:val="22"/>
-        </w:rPr>
-        <w:t xml:space="preserve">    if fin - inicio &lt;= bloque_base:                    # caso base: conteo directo</w:t>
+        <w:t xml:space="preserve">    </w:t>
+      </w:r>
+      <w:proofErr w:type="spellStart"/>
+      <w:r>
+        <w:t>if</w:t>
+      </w:r>
+      <w:proofErr w:type="spellEnd"/>
+      <w:r>
+        <w:t xml:space="preserve"> fin - inicio &lt;= </w:t>
+      </w:r>
+      <w:proofErr w:type="spellStart"/>
+      <w:r>
+        <w:t>bloque_base</w:t>
+      </w:r>
+      <w:proofErr w:type="spellEnd"/>
+      <w:r>
+        <w:t>:                    # caso base: conteo directo</w:t>
       </w:r>
     </w:p>
     <w:p>
@@ -2638,15 +3064,43 @@
           <w:left w:val="single" w:sz="12" w:space="6" w:color="1F497D"/>
         </w:pBdr>
         <w:shd w:val="clear" w:color="auto" w:fill="F2F5F8"/>
-        <w:spacing w:after="0" w:before="0" w:line="240" w:lineRule="auto"/>
+        <w:spacing w:after="0" w:line="240" w:lineRule="auto"/>
         <w:ind w:left="280" w:right="120"/>
       </w:pPr>
       <w:r>
-        <w:rPr>
-          <w:color w:val="111827"/>
-          <w:sz w:val="22"/>
-        </w:rPr>
-        <w:t xml:space="preserve">        return _contar_rango(grupos, codigos, inicio, fin)</w:t>
+        <w:t xml:space="preserve">        </w:t>
+      </w:r>
+      <w:proofErr w:type="spellStart"/>
+      <w:r>
+        <w:t>return</w:t>
+      </w:r>
+      <w:proofErr w:type="spellEnd"/>
+      <w:r>
+        <w:t xml:space="preserve"> _</w:t>
+      </w:r>
+      <w:proofErr w:type="spellStart"/>
+      <w:r>
+        <w:t>contar_</w:t>
+      </w:r>
+      <w:proofErr w:type="gramStart"/>
+      <w:r>
+        <w:t>rango</w:t>
+      </w:r>
+      <w:proofErr w:type="spellEnd"/>
+      <w:r>
+        <w:t>(</w:t>
+      </w:r>
+      <w:proofErr w:type="gramEnd"/>
+      <w:r>
+        <w:t xml:space="preserve">grupos, </w:t>
+      </w:r>
+      <w:proofErr w:type="spellStart"/>
+      <w:r>
+        <w:t>codigos</w:t>
+      </w:r>
+      <w:proofErr w:type="spellEnd"/>
+      <w:r>
+        <w:t>, inicio, fin)</w:t>
       </w:r>
     </w:p>
     <w:p>
@@ -2656,14 +3110,10 @@
           <w:left w:val="single" w:sz="12" w:space="6" w:color="1F497D"/>
         </w:pBdr>
         <w:shd w:val="clear" w:color="auto" w:fill="F2F5F8"/>
-        <w:spacing w:after="0" w:before="0" w:line="240" w:lineRule="auto"/>
+        <w:spacing w:after="0" w:line="240" w:lineRule="auto"/>
         <w:ind w:left="280" w:right="120"/>
       </w:pPr>
       <w:r>
-        <w:rPr>
-          <w:color w:val="111827"/>
-          <w:sz w:val="22"/>
-        </w:rPr>
         <w:t xml:space="preserve">    medio = (inicio + fin) // 2</w:t>
       </w:r>
     </w:p>
@@ -2674,15 +3124,43 @@
           <w:left w:val="single" w:sz="12" w:space="6" w:color="1F497D"/>
         </w:pBdr>
         <w:shd w:val="clear" w:color="auto" w:fill="F2F5F8"/>
-        <w:spacing w:after="0" w:before="0" w:line="240" w:lineRule="auto"/>
+        <w:spacing w:after="0" w:line="240" w:lineRule="auto"/>
         <w:ind w:left="280" w:right="120"/>
       </w:pPr>
       <w:r>
-        <w:rPr>
-          <w:color w:val="111827"/>
-          <w:sz w:val="22"/>
-        </w:rPr>
-        <w:t xml:space="preserve">    izquierda = _contar_dividiendo(grupos, codigos, inicio, medio, bloque_base)</w:t>
+        <w:t xml:space="preserve">    izquierda = _</w:t>
+      </w:r>
+      <w:proofErr w:type="spellStart"/>
+      <w:r>
+        <w:t>contar_</w:t>
+      </w:r>
+      <w:proofErr w:type="gramStart"/>
+      <w:r>
+        <w:t>dividiendo</w:t>
+      </w:r>
+      <w:proofErr w:type="spellEnd"/>
+      <w:r>
+        <w:t>(</w:t>
+      </w:r>
+      <w:proofErr w:type="gramEnd"/>
+      <w:r>
+        <w:t xml:space="preserve">grupos, </w:t>
+      </w:r>
+      <w:proofErr w:type="spellStart"/>
+      <w:r>
+        <w:t>codigos</w:t>
+      </w:r>
+      <w:proofErr w:type="spellEnd"/>
+      <w:r>
+        <w:t xml:space="preserve">, inicio, medio, </w:t>
+      </w:r>
+      <w:proofErr w:type="spellStart"/>
+      <w:r>
+        <w:t>bloque_base</w:t>
+      </w:r>
+      <w:proofErr w:type="spellEnd"/>
+      <w:r>
+        <w:t>)</w:t>
       </w:r>
     </w:p>
     <w:p>
@@ -2692,15 +3170,43 @@
           <w:left w:val="single" w:sz="12" w:space="6" w:color="1F497D"/>
         </w:pBdr>
         <w:shd w:val="clear" w:color="auto" w:fill="F2F5F8"/>
-        <w:spacing w:after="0" w:before="0" w:line="240" w:lineRule="auto"/>
+        <w:spacing w:after="0" w:line="240" w:lineRule="auto"/>
         <w:ind w:left="280" w:right="120"/>
       </w:pPr>
       <w:r>
-        <w:rPr>
-          <w:color w:val="111827"/>
-          <w:sz w:val="22"/>
-        </w:rPr>
-        <w:t xml:space="preserve">    derecha = _contar_dividiendo(grupos, codigos, medio, fin, bloque_base)</w:t>
+        <w:t xml:space="preserve">    derecha = _</w:t>
+      </w:r>
+      <w:proofErr w:type="spellStart"/>
+      <w:r>
+        <w:t>contar_</w:t>
+      </w:r>
+      <w:proofErr w:type="gramStart"/>
+      <w:r>
+        <w:t>dividiendo</w:t>
+      </w:r>
+      <w:proofErr w:type="spellEnd"/>
+      <w:r>
+        <w:t>(</w:t>
+      </w:r>
+      <w:proofErr w:type="gramEnd"/>
+      <w:r>
+        <w:t xml:space="preserve">grupos, </w:t>
+      </w:r>
+      <w:proofErr w:type="spellStart"/>
+      <w:r>
+        <w:t>codigos</w:t>
+      </w:r>
+      <w:proofErr w:type="spellEnd"/>
+      <w:r>
+        <w:t xml:space="preserve">, medio, fin, </w:t>
+      </w:r>
+      <w:proofErr w:type="spellStart"/>
+      <w:r>
+        <w:t>bloque_base</w:t>
+      </w:r>
+      <w:proofErr w:type="spellEnd"/>
+      <w:r>
+        <w:t>)</w:t>
       </w:r>
     </w:p>
     <w:p>
@@ -2710,15 +3216,29 @@
           <w:left w:val="single" w:sz="12" w:space="6" w:color="1F497D"/>
         </w:pBdr>
         <w:shd w:val="clear" w:color="auto" w:fill="F2F5F8"/>
-        <w:spacing w:after="0" w:before="0" w:line="240" w:lineRule="auto"/>
+        <w:spacing w:after="0" w:line="240" w:lineRule="auto"/>
         <w:ind w:left="280" w:right="120"/>
       </w:pPr>
       <w:r>
-        <w:rPr>
-          <w:color w:val="111827"/>
-          <w:sz w:val="22"/>
-        </w:rPr>
-        <w:t xml:space="preserve">    for grupo, valores in derecha.items():             # combina los conteos parciales</w:t>
+        <w:t xml:space="preserve">    </w:t>
+      </w:r>
+      <w:proofErr w:type="spellStart"/>
+      <w:r>
+        <w:t>for</w:t>
+      </w:r>
+      <w:proofErr w:type="spellEnd"/>
+      <w:r>
+        <w:t xml:space="preserve"> grupo, valores in </w:t>
+      </w:r>
+      <w:proofErr w:type="spellStart"/>
+      <w:proofErr w:type="gramStart"/>
+      <w:r>
+        <w:t>derecha.items</w:t>
+      </w:r>
+      <w:proofErr w:type="spellEnd"/>
+      <w:proofErr w:type="gramEnd"/>
+      <w:r>
+        <w:t>():             # combina los conteos parciales</w:t>
       </w:r>
     </w:p>
     <w:p>
@@ -2728,15 +3248,21 @@
           <w:left w:val="single" w:sz="12" w:space="6" w:color="1F497D"/>
         </w:pBdr>
         <w:shd w:val="clear" w:color="auto" w:fill="F2F5F8"/>
-        <w:spacing w:after="0" w:before="0" w:line="240" w:lineRule="auto"/>
+        <w:spacing w:after="0" w:line="240" w:lineRule="auto"/>
         <w:ind w:left="280" w:right="120"/>
       </w:pPr>
       <w:r>
-        <w:rPr>
-          <w:color w:val="111827"/>
-          <w:sz w:val="22"/>
-        </w:rPr>
-        <w:t xml:space="preserve">        acumulado = izquierda.setdefault(grupo, [0, 0, 0])</w:t>
+        <w:t xml:space="preserve">        acumulado = </w:t>
+      </w:r>
+      <w:proofErr w:type="spellStart"/>
+      <w:proofErr w:type="gramStart"/>
+      <w:r>
+        <w:t>izquierda.setdefault</w:t>
+      </w:r>
+      <w:proofErr w:type="spellEnd"/>
+      <w:proofErr w:type="gramEnd"/>
+      <w:r>
+        <w:t>(grupo, [0, 0, 0])</w:t>
       </w:r>
     </w:p>
     <w:p>
@@ -2746,15 +3272,32 @@
           <w:left w:val="single" w:sz="12" w:space="6" w:color="1F497D"/>
         </w:pBdr>
         <w:shd w:val="clear" w:color="auto" w:fill="F2F5F8"/>
-        <w:spacing w:after="0" w:before="0" w:line="240" w:lineRule="auto"/>
+        <w:spacing w:after="0" w:line="240" w:lineRule="auto"/>
         <w:ind w:left="280" w:right="120"/>
       </w:pPr>
       <w:r>
-        <w:rPr>
-          <w:color w:val="111827"/>
-          <w:sz w:val="22"/>
-        </w:rPr>
-        <w:t xml:space="preserve">        for i in range(3):</w:t>
+        <w:t xml:space="preserve">        </w:t>
+      </w:r>
+      <w:proofErr w:type="spellStart"/>
+      <w:r>
+        <w:t>for</w:t>
+      </w:r>
+      <w:proofErr w:type="spellEnd"/>
+      <w:r>
+        <w:t xml:space="preserve"> i in </w:t>
+      </w:r>
+      <w:proofErr w:type="spellStart"/>
+      <w:proofErr w:type="gramStart"/>
+      <w:r>
+        <w:t>range</w:t>
+      </w:r>
+      <w:proofErr w:type="spellEnd"/>
+      <w:r>
+        <w:t>(</w:t>
+      </w:r>
+      <w:proofErr w:type="gramEnd"/>
+      <w:r>
+        <w:t>3):</w:t>
       </w:r>
     </w:p>
     <w:p>
@@ -2764,38 +3307,36 @@
           <w:left w:val="single" w:sz="12" w:space="6" w:color="1F497D"/>
         </w:pBdr>
         <w:shd w:val="clear" w:color="auto" w:fill="F2F5F8"/>
-        <w:spacing w:after="0" w:before="0" w:line="240" w:lineRule="auto"/>
+        <w:spacing w:after="0" w:line="240" w:lineRule="auto"/>
         <w:ind w:left="280" w:right="120"/>
       </w:pPr>
       <w:r>
-        <w:rPr>
-          <w:color w:val="111827"/>
-          <w:sz w:val="22"/>
-        </w:rPr>
         <w:t xml:space="preserve">            acumulado[i] += valores[i]</w:t>
       </w:r>
     </w:p>
     <w:p>
       <w:pPr>
-        <w:keepNext w:val="0"/>
         <w:pBdr>
           <w:left w:val="single" w:sz="12" w:space="6" w:color="1F497D"/>
         </w:pBdr>
         <w:shd w:val="clear" w:color="auto" w:fill="F2F5F8"/>
-        <w:spacing w:after="160" w:before="0" w:line="240" w:lineRule="auto"/>
+        <w:spacing w:after="160" w:line="240" w:lineRule="auto"/>
         <w:ind w:left="280" w:right="120"/>
       </w:pPr>
       <w:r>
-        <w:rPr>
-          <w:color w:val="111827"/>
-          <w:sz w:val="22"/>
-        </w:rPr>
-        <w:t xml:space="preserve">    return izquierda</w:t>
-      </w:r>
-    </w:p>
-    <w:p>
-      <w:pPr>
-        <w:spacing w:after="120"/>
+        <w:t xml:space="preserve">    </w:t>
+      </w:r>
+      <w:proofErr w:type="spellStart"/>
+      <w:r>
+        <w:t>return</w:t>
+      </w:r>
+      <w:proofErr w:type="spellEnd"/>
+      <w:r>
+        <w:t xml:space="preserve"> izquierda</w:t>
+      </w:r>
+    </w:p>
+    <w:p>
+      <w:pPr>
         <w:jc w:val="both"/>
       </w:pPr>
       <w:r>
@@ -2806,12 +3347,17 @@
       <w:pPr>
         <w:pStyle w:val="Descripcin1"/>
         <w:keepNext/>
-        <w:spacing w:after="0" w:before="120"/>
+        <w:spacing w:before="120" w:after="0"/>
+        <w:rPr>
+          <w:lang w:val="es-CL"/>
+        </w:rPr>
       </w:pPr>
       <w:r>
         <w:rPr>
           <w:b/>
-        </w:rPr>
+          <w:lang w:val="es-CL"/>
+        </w:rPr>
+        <w:lastRenderedPageBreak/>
         <w:t>Tabla 2</w:t>
       </w:r>
     </w:p>
@@ -2820,10 +3366,14 @@
         <w:pStyle w:val="Descripcin1"/>
         <w:keepNext/>
         <w:spacing w:after="80"/>
+        <w:rPr>
+          <w:lang w:val="es-CL"/>
+        </w:rPr>
       </w:pPr>
       <w:r>
         <w:rPr>
           <w:i/>
+          <w:lang w:val="es-CL"/>
         </w:rPr>
         <w:t>Arquitectura, principios orientados a objetos y verificación</w:t>
       </w:r>
@@ -2833,7 +3383,7 @@
         <w:tblStyle w:val="Tablaconcuadrcula1clara-nfasis1"/>
         <w:tblW w:w="9936" w:type="dxa"/>
         <w:tblLayout w:type="fixed"/>
-        <w:tblLook w:firstColumn="0" w:firstRow="1" w:lastColumn="0" w:lastRow="0" w:noHBand="0" w:noVBand="1" w:val="04A0"/>
+        <w:tblLook w:val="0420" w:firstRow="1" w:lastRow="0" w:firstColumn="0" w:lastColumn="0" w:noHBand="0" w:noVBand="1"/>
       </w:tblPr>
       <w:tblGrid>
         <w:gridCol w:w="1590"/>
@@ -2842,6 +3392,7 @@
       </w:tblGrid>
       <w:tr>
         <w:trPr>
+          <w:cnfStyle w:val="100000000000" w:firstRow="1" w:lastRow="0" w:firstColumn="0" w:lastColumn="0" w:oddVBand="0" w:evenVBand="0" w:oddHBand="0" w:evenHBand="0" w:firstRowFirstColumn="0" w:firstRowLastColumn="0" w:lastRowFirstColumn="0" w:lastRowLastColumn="0"/>
           <w:tblHeader/>
         </w:trPr>
         <w:tc>
@@ -2858,9 +3409,7 @@
             </w:pPr>
             <w:r>
               <w:rPr>
-                <w:b/>
                 <w:color w:val="FFFFFF"/>
-                <w:sz w:val="22"/>
               </w:rPr>
               <w:t>Componente</w:t>
             </w:r>
@@ -2880,9 +3429,7 @@
             </w:pPr>
             <w:r>
               <w:rPr>
-                <w:b/>
                 <w:color w:val="FFFFFF"/>
-                <w:sz w:val="22"/>
               </w:rPr>
               <w:t>Decisión de diseño</w:t>
             </w:r>
@@ -2902,9 +3449,7 @@
             </w:pPr>
             <w:r>
               <w:rPr>
-                <w:b/>
                 <w:color w:val="FFFFFF"/>
-                <w:sz w:val="22"/>
               </w:rPr>
               <w:t>Comprobación</w:t>
             </w:r>
@@ -2924,12 +3469,8 @@
             <w:pPr>
               <w:keepNext/>
               <w:spacing w:before="40" w:after="40" w:line="240" w:lineRule="auto"/>
-              <w:jc w:val="left"/>
             </w:pPr>
             <w:r>
-              <w:rPr>
-                <w:sz w:val="22"/>
-              </w:rPr>
               <w:t>Lectura</w:t>
             </w:r>
           </w:p>
@@ -2943,30 +3484,21 @@
             <w:pPr>
               <w:keepNext/>
               <w:spacing w:before="40" w:after="40" w:line="240" w:lineRule="auto"/>
-              <w:jc w:val="left"/>
             </w:pPr>
+            <w:proofErr w:type="spellStart"/>
             <w:r>
-              <w:rPr>
-                <w:sz w:val="22"/>
-              </w:rPr>
               <w:t>LectorDatos</w:t>
             </w:r>
+            <w:proofErr w:type="spellEnd"/>
             <w:r>
-              <w:rPr>
-                <w:sz w:val="22"/>
-              </w:rPr>
               <w:t xml:space="preserve"> define el contrato y </w:t>
             </w:r>
+            <w:proofErr w:type="spellStart"/>
             <w:r>
-              <w:rPr>
-                <w:sz w:val="22"/>
-              </w:rPr>
               <w:t>LectorCSV</w:t>
             </w:r>
+            <w:proofErr w:type="spellEnd"/>
             <w:r>
-              <w:rPr>
-                <w:sz w:val="22"/>
-              </w:rPr>
               <w:t xml:space="preserve"> implementa la lectura.</w:t>
             </w:r>
           </w:p>
@@ -2980,12 +3512,8 @@
             <w:pPr>
               <w:keepNext/>
               <w:spacing w:before="40" w:after="40" w:line="240" w:lineRule="auto"/>
-              <w:jc w:val="left"/>
             </w:pPr>
             <w:r>
-              <w:rPr>
-                <w:sz w:val="22"/>
-              </w:rPr>
               <w:t>Herencia y polimorfismo.</w:t>
             </w:r>
           </w:p>
@@ -3005,12 +3533,8 @@
             <w:pPr>
               <w:keepNext/>
               <w:spacing w:before="40" w:after="40" w:line="240" w:lineRule="auto"/>
-              <w:jc w:val="left"/>
             </w:pPr>
             <w:r>
-              <w:rPr>
-                <w:sz w:val="22"/>
-              </w:rPr>
               <w:t>Limpieza</w:t>
             </w:r>
           </w:p>
@@ -3025,18 +3549,13 @@
             <w:pPr>
               <w:keepNext/>
               <w:spacing w:before="40" w:after="40" w:line="240" w:lineRule="auto"/>
-              <w:jc w:val="left"/>
             </w:pPr>
+            <w:proofErr w:type="spellStart"/>
             <w:r>
-              <w:rPr>
-                <w:sz w:val="22"/>
-              </w:rPr>
               <w:t>LimpiadorLicitaciones</w:t>
             </w:r>
+            <w:proofErr w:type="spellEnd"/>
             <w:r>
-              <w:rPr>
-                <w:sz w:val="22"/>
-              </w:rPr>
               <w:t xml:space="preserve"> coordina transformaciones y protege su resumen interno.</w:t>
             </w:r>
           </w:p>
@@ -3051,12 +3570,8 @@
             <w:pPr>
               <w:keepNext/>
               <w:spacing w:before="40" w:after="40" w:line="240" w:lineRule="auto"/>
-              <w:jc w:val="left"/>
             </w:pPr>
             <w:r>
-              <w:rPr>
-                <w:sz w:val="22"/>
-              </w:rPr>
               <w:t>La copia devuelta no altera el estado.</w:t>
             </w:r>
           </w:p>
@@ -3075,12 +3590,8 @@
             <w:pPr>
               <w:keepNext/>
               <w:spacing w:before="40" w:after="40" w:line="240" w:lineRule="auto"/>
-              <w:jc w:val="left"/>
             </w:pPr>
             <w:r>
-              <w:rPr>
-                <w:sz w:val="22"/>
-              </w:rPr>
               <w:t>Validación</w:t>
             </w:r>
           </w:p>
@@ -3094,18 +3605,13 @@
             <w:pPr>
               <w:keepNext/>
               <w:spacing w:before="40" w:after="40" w:line="240" w:lineRule="auto"/>
-              <w:jc w:val="left"/>
             </w:pPr>
+            <w:proofErr w:type="spellStart"/>
             <w:r>
-              <w:rPr>
-                <w:sz w:val="22"/>
-              </w:rPr>
               <w:t>ReglaValidacion</w:t>
             </w:r>
+            <w:proofErr w:type="spellEnd"/>
             <w:r>
-              <w:rPr>
-                <w:sz w:val="22"/>
-              </w:rPr>
               <w:t xml:space="preserve"> permite reglas intercambiables; el validador las compone.</w:t>
             </w:r>
           </w:p>
@@ -3119,12 +3625,8 @@
             <w:pPr>
               <w:keepNext/>
               <w:spacing w:before="40" w:after="40" w:line="240" w:lineRule="auto"/>
-              <w:jc w:val="left"/>
             </w:pPr>
             <w:r>
-              <w:rPr>
-                <w:sz w:val="22"/>
-              </w:rPr>
               <w:t>Lista vacía rechazada; casos de error cubiertos.</w:t>
             </w:r>
           </w:p>
@@ -3144,12 +3646,8 @@
             <w:pPr>
               <w:keepNext/>
               <w:spacing w:before="40" w:after="40" w:line="240" w:lineRule="auto"/>
-              <w:jc w:val="left"/>
             </w:pPr>
             <w:r>
-              <w:rPr>
-                <w:sz w:val="22"/>
-              </w:rPr>
               <w:t>Análisis</w:t>
             </w:r>
           </w:p>
@@ -3164,12 +3662,8 @@
             <w:pPr>
               <w:keepNext/>
               <w:spacing w:before="40" w:after="40" w:line="240" w:lineRule="auto"/>
-              <w:jc w:val="left"/>
             </w:pPr>
             <w:r>
-              <w:rPr>
-                <w:sz w:val="22"/>
-              </w:rPr>
               <w:t>Cuatro funciones con los mismos parámetros, intercambiables entre sí.</w:t>
             </w:r>
           </w:p>
@@ -3184,12 +3678,8 @@
             <w:pPr>
               <w:keepNext/>
               <w:spacing w:before="40" w:after="40" w:line="240" w:lineRule="auto"/>
-              <w:jc w:val="left"/>
             </w:pPr>
             <w:r>
-              <w:rPr>
-                <w:sz w:val="22"/>
-              </w:rPr>
               <w:t>Mismo resultado que F2 antes de medir.</w:t>
             </w:r>
           </w:p>
@@ -3201,56 +3691,68 @@
         <w:pStyle w:val="Descripcin1"/>
         <w:spacing w:before="60" w:after="200"/>
         <w:jc w:val="both"/>
+        <w:rPr>
+          <w:lang w:val="es-CL"/>
+        </w:rPr>
       </w:pPr>
       <w:r>
         <w:rPr>
           <w:i/>
-          <w:sz w:val="22"/>
+          <w:lang w:val="es-CL"/>
         </w:rPr>
         <w:t xml:space="preserve">Nota. </w:t>
       </w:r>
       <w:r>
         <w:rPr>
-          <w:sz w:val="22"/>
+          <w:lang w:val="es-CL"/>
         </w:rPr>
         <w:t>La suite de F3 contiene 29 pruebas y F4 añade 10 pruebas de visualización; las 39 finalizaron correctamente.</w:t>
       </w:r>
     </w:p>
     <w:p>
       <w:pPr>
-        <w:spacing w:after="120"/>
         <w:jc w:val="both"/>
       </w:pPr>
       <w:r>
         <w:t xml:space="preserve">La herencia aparece en las interfaces abstractas </w:t>
       </w:r>
+      <w:proofErr w:type="spellStart"/>
       <w:r>
         <w:t>LectorDatos</w:t>
       </w:r>
+      <w:proofErr w:type="spellEnd"/>
       <w:r>
         <w:t xml:space="preserve"> y </w:t>
       </w:r>
+      <w:proofErr w:type="spellStart"/>
       <w:r>
         <w:t>ReglaValidacion</w:t>
       </w:r>
+      <w:proofErr w:type="spellEnd"/>
       <w:r>
         <w:t xml:space="preserve">, definidas con el módulo </w:t>
       </w:r>
+      <w:proofErr w:type="spellStart"/>
       <w:r>
         <w:t>abc</w:t>
       </w:r>
-      <w:r>
-        <w:t xml:space="preserve"> (Python Software Foundation, s. f.-c). El polimorfismo permite que el validador invoque </w:t>
-      </w:r>
-      <w:r>
-        <w:t>validar</w:t>
-      </w:r>
-      <w:r>
-        <w:t xml:space="preserve"> sin conocer la regla concreta, y el encapsulamiento impide que una modificación externa del resumen del limpiador cambie su estado. Separar lectura, limpieza y validación en clases con una sola responsabilidad sigue los criterios de diseño de Lott y Phillips (2021). El validador distingue </w:t>
-      </w:r>
+      <w:proofErr w:type="spellEnd"/>
+      <w:r>
+        <w:t xml:space="preserve"> (Python Software </w:t>
+      </w:r>
+      <w:proofErr w:type="spellStart"/>
+      <w:r>
+        <w:t>Foundation</w:t>
+      </w:r>
+      <w:proofErr w:type="spellEnd"/>
+      <w:r>
+        <w:t xml:space="preserve">, s. f.-c). El polimorfismo permite que el validador invoque validar sin conocer la regla concreta, y el encapsulamiento impide que una modificación externa del resumen del limpiador cambie su estado. Separar lectura, limpieza y validación en clases con una sola responsabilidad sigue los criterios de diseño de Lott y Phillips (2021). El validador distingue </w:t>
+      </w:r>
+      <w:proofErr w:type="spellStart"/>
       <w:r>
         <w:t>None</w:t>
       </w:r>
+      <w:proofErr w:type="spellEnd"/>
       <w:r>
         <w:t>, que selecciona las reglas predeterminadas, de una lista vacía, que produce un error explícito.</w:t>
       </w:r>
@@ -3260,26 +3762,25 @@
         <w:pStyle w:val="Ttulo11"/>
         <w:keepLines/>
         <w:spacing w:before="240"/>
-      </w:pPr>
-      <w:bookmarkStart w:id="107" w:name="_Toc900107"/>
-      <w:r>
+        <w:rPr>
+          <w:lang w:val="es-CL"/>
+        </w:rPr>
+      </w:pPr>
+      <w:bookmarkStart w:id="6" w:name="_Toc900107"/>
+      <w:r>
+        <w:rPr>
+          <w:lang w:val="es-CL"/>
+        </w:rPr>
         <w:t>4. Resultados y discusión</w:t>
       </w:r>
-      <w:bookmarkEnd w:id="107"/>
-    </w:p>
-    <w:p>
-      <w:pPr>
-        <w:spacing w:after="120"/>
+      <w:bookmarkEnd w:id="6"/>
+    </w:p>
+    <w:p>
+      <w:pPr>
         <w:jc w:val="both"/>
       </w:pPr>
       <w:r>
-        <w:t xml:space="preserve">Las tablas de F4 se construyeron con 44.025 ofertas válidas pertenecientes a procesos adjudicados. Cada porcentaje utiliza su propio grupo como denominador. Las figuras se generan en </w:t>
-      </w:r>
-      <w:r>
-        <w:t>F4/F4_Comunicacion.ipynb</w:t>
-      </w:r>
-      <w:r>
-        <w:t>.</w:t>
+        <w:t>Las tablas de F4 se construyeron con 44.025 ofertas válidas pertenecientes a procesos adjudicados. Cada porcentaje utiliza su propio grupo como denominador. Las figuras se generan en F4/F4_Comunicacion.ipynb.</w:t>
       </w:r>
     </w:p>
     <w:p>
@@ -3287,22 +3788,32 @@
         <w:pStyle w:val="Ttulo21"/>
         <w:keepLines/>
         <w:spacing w:before="160"/>
-      </w:pPr>
-      <w:bookmarkStart w:id="108" w:name="_Toc900108"/>
-      <w:r>
+        <w:rPr>
+          <w:lang w:val="es-CL"/>
+        </w:rPr>
+      </w:pPr>
+      <w:bookmarkStart w:id="7" w:name="_Toc900108"/>
+      <w:r>
+        <w:rPr>
+          <w:lang w:val="es-CL"/>
+        </w:rPr>
         <w:t>4.1 Resultados por tamaño de proveedor</w:t>
       </w:r>
-      <w:bookmarkEnd w:id="108"/>
+      <w:bookmarkEnd w:id="7"/>
     </w:p>
     <w:p>
       <w:pPr>
         <w:pStyle w:val="Descripcin1"/>
         <w:keepNext/>
-        <w:spacing w:after="0" w:before="120"/>
+        <w:spacing w:before="120" w:after="0"/>
+        <w:rPr>
+          <w:lang w:val="es-CL"/>
+        </w:rPr>
       </w:pPr>
       <w:r>
         <w:rPr>
           <w:b/>
+          <w:lang w:val="es-CL"/>
         </w:rPr>
         <w:t>Figura 1</w:t>
       </w:r>
@@ -3312,10 +3823,14 @@
         <w:pStyle w:val="Descripcin1"/>
         <w:keepNext/>
         <w:spacing w:after="80"/>
+        <w:rPr>
+          <w:lang w:val="es-CL"/>
+        </w:rPr>
       </w:pPr>
       <w:r>
         <w:rPr>
           <w:i/>
+          <w:lang w:val="es-CL"/>
         </w:rPr>
         <w:t>Proporción de ofertas ganadoras según el tamaño del proveedor</w:t>
       </w:r>
@@ -3327,22 +3842,26 @@
         <w:jc w:val="center"/>
       </w:pPr>
       <w:r>
+        <w:rPr>
+          <w:noProof/>
+        </w:rPr>
         <w:drawing>
-          <wp:inline xmlns:a="http://schemas.openxmlformats.org/drawingml/2006/main" xmlns:pic="http://schemas.openxmlformats.org/drawingml/2006/picture">
+          <wp:inline distT="0" distB="0" distL="0" distR="0" wp14:anchorId="1F0CC9B5" wp14:editId="48A2DE00">
             <wp:extent cx="4754880" cy="2627697"/>
+            <wp:effectExtent l="0" t="0" r="0" b="0"/>
             <wp:docPr id="12" name="Picture 12"/>
             <wp:cNvGraphicFramePr>
-              <a:graphicFrameLocks noChangeAspect="1"/>
+              <a:graphicFrameLocks xmlns:a="http://schemas.openxmlformats.org/drawingml/2006/main" noChangeAspect="1"/>
             </wp:cNvGraphicFramePr>
-            <a:graphic>
+            <a:graphic xmlns:a="http://schemas.openxmlformats.org/drawingml/2006/main">
               <a:graphicData uri="http://schemas.openxmlformats.org/drawingml/2006/picture">
-                <pic:pic>
+                <pic:pic xmlns:pic="http://schemas.openxmlformats.org/drawingml/2006/picture">
                   <pic:nvPicPr>
                     <pic:cNvPr id="0" name="grafico1_tamano_proveedor.png"/>
                     <pic:cNvPicPr/>
                   </pic:nvPicPr>
                   <pic:blipFill>
-                    <a:blip r:embed="rId41"/>
+                    <a:blip r:embed="rId22"/>
                     <a:stretch>
                       <a:fillRect/>
                     </a:stretch>
@@ -3352,7 +3871,9 @@
                       <a:off x="0" y="0"/>
                       <a:ext cx="4754880" cy="2627697"/>
                     </a:xfrm>
-                    <a:prstGeom prst="rect"/>
+                    <a:prstGeom prst="rect">
+                      <a:avLst/>
+                    </a:prstGeom>
                   </pic:spPr>
                 </pic:pic>
               </a:graphicData>
@@ -3366,24 +3887,47 @@
         <w:pStyle w:val="Descripcin1"/>
         <w:spacing w:before="60" w:after="200"/>
         <w:jc w:val="both"/>
+        <w:rPr>
+          <w:lang w:val="es-CL"/>
+        </w:rPr>
       </w:pPr>
       <w:r>
         <w:rPr>
           <w:i/>
-          <w:sz w:val="22"/>
+          <w:lang w:val="es-CL"/>
         </w:rPr>
         <w:t xml:space="preserve">Nota. </w:t>
       </w:r>
       <w:r>
         <w:rPr>
-          <w:sz w:val="22"/>
-        </w:rPr>
-        <w:t>Elaboración propia a partir de Datos Abiertos de ChileCompra, marzo de 2026. n = ofertas válidas de cada grupo en procesos adjudicados.</w:t>
-      </w:r>
-    </w:p>
-    <w:p>
-      <w:pPr>
-        <w:spacing w:after="120"/>
+          <w:lang w:val="es-CL"/>
+        </w:rPr>
+        <w:t xml:space="preserve">Elaboración propia a partir de Datos Abiertos de </w:t>
+      </w:r>
+      <w:proofErr w:type="spellStart"/>
+      <w:r>
+        <w:rPr>
+          <w:lang w:val="es-CL"/>
+        </w:rPr>
+        <w:t>ChileCompra</w:t>
+      </w:r>
+      <w:proofErr w:type="spellEnd"/>
+      <w:r>
+        <w:rPr>
+          <w:lang w:val="es-CL"/>
+        </w:rPr>
+        <w:t xml:space="preserve">, marzo de 2026. n = ofertas válidas </w:t>
+      </w:r>
+      <w:r>
+        <w:rPr>
+          <w:lang w:val="es-CL"/>
+        </w:rPr>
+        <w:lastRenderedPageBreak/>
+        <w:t>de cada grupo en procesos adjudicados.</w:t>
+      </w:r>
+    </w:p>
+    <w:p>
+      <w:pPr>
         <w:jc w:val="both"/>
       </w:pPr>
       <w:r>
@@ -3395,22 +3939,32 @@
         <w:pStyle w:val="Ttulo21"/>
         <w:keepLines/>
         <w:spacing w:before="160"/>
-      </w:pPr>
-      <w:bookmarkStart w:id="109" w:name="_Toc900109"/>
-      <w:r>
+        <w:rPr>
+          <w:lang w:val="es-CL"/>
+        </w:rPr>
+      </w:pPr>
+      <w:bookmarkStart w:id="8" w:name="_Toc900109"/>
+      <w:r>
+        <w:rPr>
+          <w:lang w:val="es-CL"/>
+        </w:rPr>
         <w:t>4.2 Resultados por tipo de licitación</w:t>
       </w:r>
-      <w:bookmarkEnd w:id="109"/>
+      <w:bookmarkEnd w:id="8"/>
     </w:p>
     <w:p>
       <w:pPr>
         <w:pStyle w:val="Descripcin1"/>
         <w:keepNext/>
-        <w:spacing w:after="0" w:before="120"/>
+        <w:spacing w:before="120" w:after="0"/>
+        <w:rPr>
+          <w:lang w:val="es-CL"/>
+        </w:rPr>
       </w:pPr>
       <w:r>
         <w:rPr>
           <w:b/>
+          <w:lang w:val="es-CL"/>
         </w:rPr>
         <w:t>Figura 2</w:t>
       </w:r>
@@ -3420,10 +3974,14 @@
         <w:pStyle w:val="Descripcin1"/>
         <w:keepNext/>
         <w:spacing w:after="80"/>
+        <w:rPr>
+          <w:lang w:val="es-CL"/>
+        </w:rPr>
       </w:pPr>
       <w:r>
         <w:rPr>
           <w:i/>
+          <w:lang w:val="es-CL"/>
         </w:rPr>
         <w:t>Proporción de ofertas ganadoras según el tipo de licitación</w:t>
       </w:r>
@@ -3435,22 +3993,26 @@
         <w:jc w:val="center"/>
       </w:pPr>
       <w:r>
+        <w:rPr>
+          <w:noProof/>
+        </w:rPr>
         <w:drawing>
-          <wp:inline xmlns:a="http://schemas.openxmlformats.org/drawingml/2006/main" xmlns:pic="http://schemas.openxmlformats.org/drawingml/2006/picture">
+          <wp:inline distT="0" distB="0" distL="0" distR="0" wp14:anchorId="2B2B7726" wp14:editId="3D86BBC8">
             <wp:extent cx="4754880" cy="3253339"/>
+            <wp:effectExtent l="0" t="0" r="0" b="0"/>
             <wp:docPr id="13" name="Picture 13"/>
             <wp:cNvGraphicFramePr>
-              <a:graphicFrameLocks noChangeAspect="1"/>
+              <a:graphicFrameLocks xmlns:a="http://schemas.openxmlformats.org/drawingml/2006/main" noChangeAspect="1"/>
             </wp:cNvGraphicFramePr>
-            <a:graphic>
+            <a:graphic xmlns:a="http://schemas.openxmlformats.org/drawingml/2006/main">
               <a:graphicData uri="http://schemas.openxmlformats.org/drawingml/2006/picture">
-                <pic:pic>
+                <pic:pic xmlns:pic="http://schemas.openxmlformats.org/drawingml/2006/picture">
                   <pic:nvPicPr>
                     <pic:cNvPr id="0" name="grafico2_tipo_licitacion.png"/>
                     <pic:cNvPicPr/>
                   </pic:nvPicPr>
                   <pic:blipFill>
-                    <a:blip r:embed="rId42"/>
+                    <a:blip r:embed="rId23"/>
                     <a:stretch>
                       <a:fillRect/>
                     </a:stretch>
@@ -3460,7 +4022,9 @@
                       <a:off x="0" y="0"/>
                       <a:ext cx="4754880" cy="3253339"/>
                     </a:xfrm>
-                    <a:prstGeom prst="rect"/>
+                    <a:prstGeom prst="rect">
+                      <a:avLst/>
+                    </a:prstGeom>
                   </pic:spPr>
                 </pic:pic>
               </a:graphicData>
@@ -3474,24 +4038,40 @@
         <w:pStyle w:val="Descripcin1"/>
         <w:spacing w:before="60" w:after="200"/>
         <w:jc w:val="both"/>
+        <w:rPr>
+          <w:lang w:val="es-CL"/>
+        </w:rPr>
       </w:pPr>
       <w:r>
         <w:rPr>
           <w:i/>
-          <w:sz w:val="22"/>
+          <w:lang w:val="es-CL"/>
         </w:rPr>
         <w:t xml:space="preserve">Nota. </w:t>
       </w:r>
       <w:r>
         <w:rPr>
-          <w:sz w:val="22"/>
-        </w:rPr>
-        <w:t>Elaboración propia a partir de Datos Abiertos de ChileCompra, marzo de 2026. Los tipos con menos de 100 ofertas se muestran en un tono más claro.</w:t>
-      </w:r>
-    </w:p>
-    <w:p>
-      <w:pPr>
-        <w:spacing w:after="120"/>
+          <w:lang w:val="es-CL"/>
+        </w:rPr>
+        <w:t xml:space="preserve">Elaboración propia a partir de Datos Abiertos de </w:t>
+      </w:r>
+      <w:proofErr w:type="spellStart"/>
+      <w:r>
+        <w:rPr>
+          <w:lang w:val="es-CL"/>
+        </w:rPr>
+        <w:t>ChileCompra</w:t>
+      </w:r>
+      <w:proofErr w:type="spellEnd"/>
+      <w:r>
+        <w:rPr>
+          <w:lang w:val="es-CL"/>
+        </w:rPr>
+        <w:t>, marzo de 2026. Los tipos con menos de 100 ofertas se muestran en un tono más claro.</w:t>
+      </w:r>
+    </w:p>
+    <w:p>
+      <w:pPr>
         <w:jc w:val="both"/>
       </w:pPr>
       <w:r>
@@ -3503,22 +4083,33 @@
         <w:pStyle w:val="Ttulo21"/>
         <w:keepLines/>
         <w:spacing w:before="160"/>
-      </w:pPr>
-      <w:bookmarkStart w:id="110" w:name="_Toc900110"/>
-      <w:r>
+        <w:rPr>
+          <w:lang w:val="es-CL"/>
+        </w:rPr>
+      </w:pPr>
+      <w:bookmarkStart w:id="9" w:name="_Toc900110"/>
+      <w:r>
+        <w:rPr>
+          <w:lang w:val="es-CL"/>
+        </w:rPr>
+        <w:lastRenderedPageBreak/>
         <w:t>4.3 Plazos de cierre y discusión</w:t>
       </w:r>
-      <w:bookmarkEnd w:id="110"/>
+      <w:bookmarkEnd w:id="9"/>
     </w:p>
     <w:p>
       <w:pPr>
         <w:pStyle w:val="Descripcin1"/>
         <w:keepNext/>
-        <w:spacing w:after="0" w:before="120"/>
+        <w:spacing w:before="120" w:after="0"/>
+        <w:rPr>
+          <w:lang w:val="es-CL"/>
+        </w:rPr>
       </w:pPr>
       <w:r>
         <w:rPr>
           <w:b/>
+          <w:lang w:val="es-CL"/>
         </w:rPr>
         <w:t>Figura 3</w:t>
       </w:r>
@@ -3528,10 +4119,14 @@
         <w:pStyle w:val="Descripcin1"/>
         <w:keepNext/>
         <w:spacing w:after="80"/>
+        <w:rPr>
+          <w:lang w:val="es-CL"/>
+        </w:rPr>
       </w:pPr>
       <w:r>
         <w:rPr>
           <w:i/>
+          <w:lang w:val="es-CL"/>
         </w:rPr>
         <w:t>Distribución del plazo de cierre según el tipo de licitación</w:t>
       </w:r>
@@ -3543,22 +4138,26 @@
         <w:jc w:val="center"/>
       </w:pPr>
       <w:r>
+        <w:rPr>
+          <w:noProof/>
+        </w:rPr>
         <w:drawing>
-          <wp:inline xmlns:a="http://schemas.openxmlformats.org/drawingml/2006/main" xmlns:pic="http://schemas.openxmlformats.org/drawingml/2006/picture">
+          <wp:inline distT="0" distB="0" distL="0" distR="0" wp14:anchorId="74DEAC5D" wp14:editId="1D875B48">
             <wp:extent cx="4754880" cy="3340929"/>
+            <wp:effectExtent l="0" t="0" r="0" b="0"/>
             <wp:docPr id="14" name="Picture 14"/>
             <wp:cNvGraphicFramePr>
-              <a:graphicFrameLocks noChangeAspect="1"/>
+              <a:graphicFrameLocks xmlns:a="http://schemas.openxmlformats.org/drawingml/2006/main" noChangeAspect="1"/>
             </wp:cNvGraphicFramePr>
-            <a:graphic>
+            <a:graphic xmlns:a="http://schemas.openxmlformats.org/drawingml/2006/main">
               <a:graphicData uri="http://schemas.openxmlformats.org/drawingml/2006/picture">
-                <pic:pic>
+                <pic:pic xmlns:pic="http://schemas.openxmlformats.org/drawingml/2006/picture">
                   <pic:nvPicPr>
                     <pic:cNvPr id="0" name="grafico3_plazo_cierre.png"/>
                     <pic:cNvPicPr/>
                   </pic:nvPicPr>
                   <pic:blipFill>
-                    <a:blip r:embed="rId43"/>
+                    <a:blip r:embed="rId24"/>
                     <a:stretch>
                       <a:fillRect/>
                     </a:stretch>
@@ -3568,7 +4167,9 @@
                       <a:off x="0" y="0"/>
                       <a:ext cx="4754880" cy="3340929"/>
                     </a:xfrm>
-                    <a:prstGeom prst="rect"/>
+                    <a:prstGeom prst="rect">
+                      <a:avLst/>
+                    </a:prstGeom>
                   </pic:spPr>
                 </pic:pic>
               </a:graphicData>
@@ -3582,24 +4183,26 @@
         <w:pStyle w:val="Descripcin1"/>
         <w:spacing w:before="60" w:after="200"/>
         <w:jc w:val="both"/>
+        <w:rPr>
+          <w:lang w:val="es-CL"/>
+        </w:rPr>
       </w:pPr>
       <w:r>
         <w:rPr>
           <w:i/>
-          <w:sz w:val="22"/>
+          <w:lang w:val="es-CL"/>
         </w:rPr>
         <w:t xml:space="preserve">Nota. </w:t>
       </w:r>
       <w:r>
         <w:rPr>
-          <w:sz w:val="22"/>
+          <w:lang w:val="es-CL"/>
         </w:rPr>
         <w:t>Elaboración propia a partir de 1.864 licitaciones únicas. Los tipos con menos de 30 procesos se muestran como puntos individuales.</w:t>
       </w:r>
     </w:p>
     <w:p>
       <w:pPr>
-        <w:spacing w:after="120"/>
         <w:jc w:val="both"/>
       </w:pPr>
       <w:r>
@@ -3608,7 +4211,6 @@
     </w:p>
     <w:p>
       <w:pPr>
-        <w:spacing w:after="120"/>
         <w:jc w:val="both"/>
       </w:pPr>
       <w:r>
@@ -3620,9 +4222,11 @@
       <w:r>
         <w:t xml:space="preserve"> El conjunto cubre un solo mes y el sector Salud: no permite observar tendencias temporales ni generalizar a todo el sistema. Los porcentajes por oferta dan mayor peso a licitaciones con más ítems u oferentes; 3.379 ofertas válidas no tienen tamaño de proveedor clasificado; y no se controlan monto ofertado, producto, institución compradora u otras variables. El principal riesgo es leer la diferencia entre tamaños como una ventaja causal. En términos técnicos, las mediciones dependen del equipo y de la caché, y </w:t>
       </w:r>
+      <w:proofErr w:type="spellStart"/>
       <w:r>
         <w:t>tracemalloc</w:t>
       </w:r>
+      <w:proofErr w:type="spellEnd"/>
       <w:r>
         <w:t xml:space="preserve"> no representa toda la memoria del proceso.</w:t>
       </w:r>
@@ -3632,16 +4236,21 @@
         <w:pStyle w:val="Ttulo11"/>
         <w:keepLines/>
         <w:spacing w:before="240"/>
-      </w:pPr>
-      <w:bookmarkStart w:id="111" w:name="_Toc900111"/>
-      <w:r>
+        <w:rPr>
+          <w:lang w:val="es-CL"/>
+        </w:rPr>
+      </w:pPr>
+      <w:bookmarkStart w:id="10" w:name="_Toc900111"/>
+      <w:r>
+        <w:rPr>
+          <w:lang w:val="es-CL"/>
+        </w:rPr>
         <w:t>5. Conclusiones y recomendaciones</w:t>
       </w:r>
-      <w:bookmarkEnd w:id="111"/>
-    </w:p>
-    <w:p>
-      <w:pPr>
-        <w:spacing w:after="120"/>
+      <w:bookmarkEnd w:id="10"/>
+    </w:p>
+    <w:p>
+      <w:pPr>
         <w:jc w:val="both"/>
       </w:pPr>
       <w:r>
@@ -3650,20 +4259,39 @@
     </w:p>
     <w:p>
       <w:pPr>
-        <w:spacing w:after="120"/>
         <w:jc w:val="both"/>
       </w:pPr>
       <w:r>
+        <w:lastRenderedPageBreak/>
         <w:t>La principal mejora técnica no provino solo de cambiar el algoritmo, sino de reducir los datos que ingresan al cálculo. Leer siete columnas con tipos definidos disminuyó el tiempo total y la memoria sin modificar los resultados. La variante agrupada resultó apropiada para el volumen completo, mientras que las alternativas iterativa y recursiva fueron competitivas en muestras pequeñas. Esta evidencia justifica la elección para este caso, no una regla general.</w:t>
       </w:r>
     </w:p>
     <w:p>
       <w:pPr>
-        <w:spacing w:after="120"/>
         <w:jc w:val="both"/>
       </w:pPr>
       <w:r>
-        <w:t>Como reflexión del equipo, separar lectura, limpieza y validación en clases facilitó repartir el trabajo y probar cada parte por separado, y medir antes de optimizar evitó decisiones basadas en intuición. Como mejora futura se recomienda ampliar el período de observación, comparar sectores, analizar por licitación además de por oferta, incorporar variables de monto y producto, y repetir las mediciones en otros equipos.</w:t>
+        <w:t xml:space="preserve">Como reflexión del equipo, separar lectura, limpieza y validación en clases facilitó repartir el trabajo y probar cada parte por separado, y medir antes de optimizar evitó decisiones basadas en intuición. La reducción de columnas descrita en la sección 3.3 muestra que definir con precisión qué datos requiere el análisis es tan importante como elegir el algoritmo. En términos de escalabilidad, todas las alternativas son lineales respecto del número de filas, por lo que el tiempo crece en proporción al volumen de datos; reducir las columnas disminuye el costo de cada fila procesada y permite ampliar el período o sumar sectores sin cambiar la arquitectura. En un entorno empresarial, esta eficiencia tiene un efecto directo en los costos: menos memoria y menos tiempo de cómputo significan una infraestructura más económica, sobre todo en servicios en la nube que cobran por uso. El beneficio aumenta cuando el análisis es recurrente, por </w:t>
+      </w:r>
+      <w:r>
+        <w:t>ejemplo,</w:t>
+      </w:r>
+      <w:r>
+        <w:t xml:space="preserve"> si se repite con cada reporte mensual de </w:t>
+      </w:r>
+      <w:proofErr w:type="spellStart"/>
+      <w:r>
+        <w:t>ChileCompra</w:t>
+      </w:r>
+      <w:proofErr w:type="spellEnd"/>
+      <w:r>
+        <w:t>, porque el ahorro de cada ejecución se acumula y el diseño modular permite automatizar el proceso sin rehacer el código.</w:t>
+      </w:r>
+      <w:r>
+        <w:t xml:space="preserve"> </w:t>
+      </w:r>
+      <w:r>
+        <w:t>Como mejora futura se recomienda ampliar el período de observación, comparar sectores, analizar por licitación además de por oferta, incorporar variables de monto y producto, y repetir las mediciones en otros equipos.</w:t>
       </w:r>
     </w:p>
     <w:p>
@@ -3671,37 +4299,48 @@
         <w:pStyle w:val="Ttulo11"/>
         <w:keepLines/>
         <w:spacing w:before="240"/>
-      </w:pPr>
-      <w:bookmarkStart w:id="112" w:name="_Toc900112"/>
-      <w:r>
+        <w:rPr>
+          <w:lang w:val="es-CL"/>
+        </w:rPr>
+      </w:pPr>
+      <w:bookmarkStart w:id="11" w:name="_Toc900112"/>
+      <w:r>
+        <w:rPr>
+          <w:lang w:val="es-CL"/>
+        </w:rPr>
         <w:t>6. Trazabilidad de mejoras</w:t>
       </w:r>
-      <w:bookmarkEnd w:id="112"/>
-    </w:p>
-    <w:p>
-      <w:pPr>
-        <w:spacing w:after="120"/>
+      <w:bookmarkEnd w:id="11"/>
+    </w:p>
+    <w:p>
+      <w:pPr>
         <w:jc w:val="both"/>
       </w:pPr>
       <w:r>
-        <w:t xml:space="preserve">La Tabla 3 relaciona las observaciones recibidas en las evaluaciones anteriores con las acciones aplicadas. El archivo </w:t>
-      </w:r>
-      <w:r>
-        <w:t>changelog.md</w:t>
-      </w:r>
-      <w:r>
-        <w:t xml:space="preserve"> del repositorio registra la fecha, la descripción, el commit y la justificación técnica de cada cambio.</w:t>
+        <w:t xml:space="preserve">La Tabla 3 relaciona las observaciones recibidas en las evaluaciones anteriores con las acciones aplicadas. El archivo changelog.md del repositorio registra la fecha, la descripción, el </w:t>
+      </w:r>
+      <w:proofErr w:type="spellStart"/>
+      <w:r>
+        <w:t>commit</w:t>
+      </w:r>
+      <w:proofErr w:type="spellEnd"/>
+      <w:r>
+        <w:t xml:space="preserve"> y la justificación técnica de cada cambio.</w:t>
       </w:r>
     </w:p>
     <w:p>
       <w:pPr>
         <w:pStyle w:val="Descripcin1"/>
         <w:keepNext/>
-        <w:spacing w:after="0" w:before="120"/>
+        <w:spacing w:before="120" w:after="0"/>
+        <w:rPr>
+          <w:lang w:val="es-CL"/>
+        </w:rPr>
       </w:pPr>
       <w:r>
         <w:rPr>
           <w:b/>
+          <w:lang w:val="es-CL"/>
         </w:rPr>
         <w:t>Tabla 3</w:t>
       </w:r>
@@ -3711,10 +4350,14 @@
         <w:pStyle w:val="Descripcin1"/>
         <w:keepNext/>
         <w:spacing w:after="80"/>
+        <w:rPr>
+          <w:lang w:val="es-CL"/>
+        </w:rPr>
       </w:pPr>
       <w:r>
         <w:rPr>
           <w:i/>
+          <w:lang w:val="es-CL"/>
         </w:rPr>
         <w:t>Observaciones recibidas y acciones incorporadas</w:t>
       </w:r>
@@ -3724,7 +4367,7 @@
         <w:tblStyle w:val="Tablaconcuadrcula1clara-nfasis1"/>
         <w:tblW w:w="9936" w:type="dxa"/>
         <w:tblLayout w:type="fixed"/>
-        <w:tblLook w:firstColumn="0" w:firstRow="1" w:lastColumn="0" w:lastRow="0" w:noHBand="0" w:noVBand="1" w:val="04A0"/>
+        <w:tblLook w:val="0420" w:firstRow="1" w:lastRow="0" w:firstColumn="0" w:lastColumn="0" w:noHBand="0" w:noVBand="1"/>
       </w:tblPr>
       <w:tblGrid>
         <w:gridCol w:w="3875"/>
@@ -3733,6 +4376,7 @@
       </w:tblGrid>
       <w:tr>
         <w:trPr>
+          <w:cnfStyle w:val="100000000000" w:firstRow="1" w:lastRow="0" w:firstColumn="0" w:lastColumn="0" w:oddVBand="0" w:evenVBand="0" w:oddHBand="0" w:evenHBand="0" w:firstRowFirstColumn="0" w:firstRowLastColumn="0" w:lastRowFirstColumn="0" w:lastRowLastColumn="0"/>
           <w:tblHeader/>
         </w:trPr>
         <w:tc>
@@ -3749,9 +4393,7 @@
             </w:pPr>
             <w:r>
               <w:rPr>
-                <w:b/>
                 <w:color w:val="FFFFFF"/>
-                <w:sz w:val="22"/>
               </w:rPr>
               <w:t>Observación</w:t>
             </w:r>
@@ -3771,12 +4413,18 @@
             </w:pPr>
             <w:r>
               <w:rPr>
-                <w:b/>
                 <w:color w:val="FFFFFF"/>
-                <w:sz w:val="22"/>
               </w:rPr>
-              <w:t>Acción y commit</w:t>
+              <w:t xml:space="preserve">Acción y </w:t>
             </w:r>
+            <w:proofErr w:type="spellStart"/>
+            <w:r>
+              <w:rPr>
+                <w:color w:val="FFFFFF"/>
+              </w:rPr>
+              <w:t>commit</w:t>
+            </w:r>
+            <w:proofErr w:type="spellEnd"/>
           </w:p>
         </w:tc>
         <w:tc>
@@ -3793,9 +4441,7 @@
             </w:pPr>
             <w:r>
               <w:rPr>
-                <w:b/>
                 <w:color w:val="FFFFFF"/>
-                <w:sz w:val="22"/>
               </w:rPr>
               <w:t>Impacto</w:t>
             </w:r>
@@ -3815,25 +4461,25 @@
             <w:pPr>
               <w:keepNext/>
               <w:spacing w:before="40" w:after="40" w:line="240" w:lineRule="auto"/>
-              <w:jc w:val="left"/>
             </w:pPr>
             <w:r>
-              <w:rPr>
-                <w:sz w:val="22"/>
-              </w:rPr>
-              <w:t xml:space="preserve">La carpeta </w:t>
+              <w:t>La carpeta data/</w:t>
             </w:r>
+            <w:proofErr w:type="spellStart"/>
             <w:r>
-              <w:rPr>
-                <w:sz w:val="22"/>
-              </w:rPr>
-              <w:t>data/processed</w:t>
+              <w:t>processed</w:t>
             </w:r>
+            <w:proofErr w:type="spellEnd"/>
             <w:r>
-              <w:rPr>
-                <w:sz w:val="22"/>
-              </w:rPr>
-              <w:t xml:space="preserve"> estaba vacía y el informe afirmaba que contenía el dataset.</w:t>
+              <w:t xml:space="preserve"> estaba vacía y el informe afirmaba que contenía el </w:t>
+            </w:r>
+            <w:proofErr w:type="spellStart"/>
+            <w:r>
+              <w:t>dataset</w:t>
+            </w:r>
+            <w:proofErr w:type="spellEnd"/>
+            <w:r>
+              <w:t>.</w:t>
             </w:r>
           </w:p>
         </w:tc>
@@ -3846,12 +4492,8 @@
             <w:pPr>
               <w:keepNext/>
               <w:spacing w:before="40" w:after="40" w:line="240" w:lineRule="auto"/>
-              <w:jc w:val="left"/>
             </w:pPr>
             <w:r>
-              <w:rPr>
-                <w:sz w:val="22"/>
-              </w:rPr>
               <w:t>El README declara que los derivados se regeneran con F2 e informa sus huellas SHA-256 (48e62d3).</w:t>
             </w:r>
           </w:p>
@@ -3865,12 +4507,8 @@
             <w:pPr>
               <w:keepNext/>
               <w:spacing w:before="40" w:after="40" w:line="240" w:lineRule="auto"/>
-              <w:jc w:val="left"/>
             </w:pPr>
             <w:r>
-              <w:rPr>
-                <w:sz w:val="22"/>
-              </w:rPr>
               <w:t>Documentación coherente con el repositorio.</w:t>
             </w:r>
           </w:p>
@@ -3890,12 +4528,8 @@
             <w:pPr>
               <w:keepNext/>
               <w:spacing w:before="40" w:after="40" w:line="240" w:lineRule="auto"/>
-              <w:jc w:val="left"/>
             </w:pPr>
             <w:r>
-              <w:rPr>
-                <w:sz w:val="22"/>
-              </w:rPr>
               <w:t>La portada indicaba MCDIA500 y no incluía el enlace al repositorio.</w:t>
             </w:r>
           </w:p>
@@ -3910,12 +4544,8 @@
             <w:pPr>
               <w:keepNext/>
               <w:spacing w:before="40" w:after="40" w:line="240" w:lineRule="auto"/>
-              <w:jc w:val="left"/>
             </w:pPr>
             <w:r>
-              <w:rPr>
-                <w:sz w:val="22"/>
-              </w:rPr>
               <w:t>Código corregido y enlace en la portada (ab661e4).</w:t>
             </w:r>
           </w:p>
@@ -3930,12 +4560,8 @@
             <w:pPr>
               <w:keepNext/>
               <w:spacing w:before="40" w:after="40" w:line="240" w:lineRule="auto"/>
-              <w:jc w:val="left"/>
             </w:pPr>
             <w:r>
-              <w:rPr>
-                <w:sz w:val="22"/>
-              </w:rPr>
               <w:t>Presentación formal correcta.</w:t>
             </w:r>
           </w:p>
@@ -3954,12 +4580,8 @@
             <w:pPr>
               <w:keepNext/>
               <w:spacing w:before="40" w:after="40" w:line="240" w:lineRule="auto"/>
-              <w:jc w:val="left"/>
             </w:pPr>
             <w:r>
-              <w:rPr>
-                <w:sz w:val="22"/>
-              </w:rPr>
               <w:t>Una misma persona aparecía con varias identidades en Git.</w:t>
             </w:r>
           </w:p>
@@ -3973,24 +4595,18 @@
             <w:pPr>
               <w:keepNext/>
               <w:spacing w:before="40" w:after="40" w:line="240" w:lineRule="auto"/>
-              <w:jc w:val="left"/>
             </w:pPr>
+            <w:proofErr w:type="gramStart"/>
             <w:r>
-              <w:rPr>
-                <w:sz w:val="22"/>
-              </w:rPr>
-              <w:t xml:space="preserve">Archivo </w:t>
+              <w:t>Archivo .</w:t>
             </w:r>
+            <w:proofErr w:type="spellStart"/>
             <w:r>
-              <w:rPr>
-                <w:sz w:val="22"/>
-              </w:rPr>
-              <w:t>.mailmap</w:t>
+              <w:t>mailmap</w:t>
             </w:r>
+            <w:proofErr w:type="spellEnd"/>
+            <w:proofErr w:type="gramEnd"/>
             <w:r>
-              <w:rPr>
-                <w:sz w:val="22"/>
-              </w:rPr>
               <w:t xml:space="preserve"> (87b1526, 9135329).</w:t>
             </w:r>
           </w:p>
@@ -4004,12 +4620,8 @@
             <w:pPr>
               <w:keepNext/>
               <w:spacing w:before="40" w:after="40" w:line="240" w:lineRule="auto"/>
-              <w:jc w:val="left"/>
             </w:pPr>
             <w:r>
-              <w:rPr>
-                <w:sz w:val="22"/>
-              </w:rPr>
               <w:t>Autoría trazable por integrante.</w:t>
             </w:r>
           </w:p>
@@ -4029,12 +4641,8 @@
             <w:pPr>
               <w:keepNext/>
               <w:spacing w:before="40" w:after="40" w:line="240" w:lineRule="auto"/>
-              <w:jc w:val="left"/>
             </w:pPr>
             <w:r>
-              <w:rPr>
-                <w:sz w:val="22"/>
-              </w:rPr>
               <w:t>Las funciones de F2 podían reorganizarse en clases.</w:t>
             </w:r>
           </w:p>
@@ -4049,12 +4657,8 @@
             <w:pPr>
               <w:keepNext/>
               <w:spacing w:before="40" w:after="40" w:line="240" w:lineRule="auto"/>
-              <w:jc w:val="left"/>
             </w:pPr>
             <w:r>
-              <w:rPr>
-                <w:sz w:val="22"/>
-              </w:rPr>
               <w:t>Contrato, lector, limpiador y validador (8087c45, 189f251).</w:t>
             </w:r>
           </w:p>
@@ -4069,12 +4673,8 @@
             <w:pPr>
               <w:keepNext/>
               <w:spacing w:before="40" w:after="40" w:line="240" w:lineRule="auto"/>
-              <w:jc w:val="left"/>
             </w:pPr>
             <w:r>
-              <w:rPr>
-                <w:sz w:val="22"/>
-              </w:rPr>
               <w:t>Modularidad y pruebas por componente.</w:t>
             </w:r>
           </w:p>
@@ -4093,12 +4693,8 @@
             <w:pPr>
               <w:keepNext/>
               <w:spacing w:before="40" w:after="40" w:line="240" w:lineRule="auto"/>
-              <w:jc w:val="left"/>
             </w:pPr>
             <w:r>
-              <w:rPr>
-                <w:sz w:val="22"/>
-              </w:rPr>
               <w:t>Convenía medir la lectura con selección de columnas y tipos.</w:t>
             </w:r>
           </w:p>
@@ -4112,12 +4708,8 @@
             <w:pPr>
               <w:keepNext/>
               <w:spacing w:before="40" w:after="40" w:line="240" w:lineRule="auto"/>
-              <w:jc w:val="left"/>
             </w:pPr>
             <w:r>
-              <w:rPr>
-                <w:sz w:val="22"/>
-              </w:rPr>
               <w:t>Lectura configurable y mediciones (7f66d24, 7a0ead5).</w:t>
             </w:r>
           </w:p>
@@ -4131,12 +4723,8 @@
             <w:pPr>
               <w:keepNext/>
               <w:spacing w:before="40" w:after="40" w:line="240" w:lineRule="auto"/>
-              <w:jc w:val="left"/>
             </w:pPr>
             <w:r>
-              <w:rPr>
-                <w:sz w:val="22"/>
-              </w:rPr>
               <w:t>Flujo 2,4 veces más rápido y 95 % menos memoria.</w:t>
             </w:r>
           </w:p>
@@ -4156,12 +4744,8 @@
             <w:pPr>
               <w:keepNext/>
               <w:spacing w:before="40" w:after="40" w:line="240" w:lineRule="auto"/>
-              <w:jc w:val="left"/>
             </w:pPr>
             <w:r>
-              <w:rPr>
-                <w:sz w:val="22"/>
-              </w:rPr>
               <w:t>Los notebooks mostraban pocos resultados intermedios.</w:t>
             </w:r>
           </w:p>
@@ -4176,12 +4760,8 @@
             <w:pPr>
               <w:keepNext/>
               <w:spacing w:before="40" w:after="40" w:line="240" w:lineRule="auto"/>
-              <w:jc w:val="left"/>
             </w:pPr>
             <w:r>
-              <w:rPr>
-                <w:sz w:val="22"/>
-              </w:rPr>
               <w:t>Notebooks F3 y F4 con un resultado por celda (e41c1fd, 5da8f2a).</w:t>
             </w:r>
           </w:p>
@@ -4196,12 +4776,8 @@
             <w:pPr>
               <w:keepNext/>
               <w:spacing w:before="40" w:after="40" w:line="240" w:lineRule="auto"/>
-              <w:jc w:val="left"/>
             </w:pPr>
             <w:r>
-              <w:rPr>
-                <w:sz w:val="22"/>
-              </w:rPr>
               <w:t>Resultados verificables paso a paso.</w:t>
             </w:r>
           </w:p>
@@ -4213,19 +4789,36 @@
         <w:pStyle w:val="Descripcin1"/>
         <w:spacing w:before="60" w:after="200"/>
         <w:jc w:val="both"/>
+        <w:rPr>
+          <w:lang w:val="es-CL"/>
+        </w:rPr>
       </w:pPr>
       <w:r>
         <w:rPr>
           <w:i/>
-          <w:sz w:val="22"/>
+          <w:lang w:val="es-CL"/>
         </w:rPr>
         <w:t xml:space="preserve">Nota. </w:t>
       </w:r>
       <w:r>
         <w:rPr>
-          <w:sz w:val="22"/>
-        </w:rPr>
-        <w:t>Los commits citados pueden consultarse en el historial del repositorio.</w:t>
+          <w:lang w:val="es-CL"/>
+        </w:rPr>
+        <w:t xml:space="preserve">Los </w:t>
+      </w:r>
+      <w:proofErr w:type="spellStart"/>
+      <w:r>
+        <w:rPr>
+          <w:lang w:val="es-CL"/>
+        </w:rPr>
+        <w:t>commits</w:t>
+      </w:r>
+      <w:proofErr w:type="spellEnd"/>
+      <w:r>
+        <w:rPr>
+          <w:lang w:val="es-CL"/>
+        </w:rPr>
+        <w:t xml:space="preserve"> citados pueden consultarse en el historial del repositorio.</w:t>
       </w:r>
     </w:p>
     <w:p>
@@ -4233,21 +4826,35 @@
         <w:pStyle w:val="Ttulo11"/>
         <w:keepLines/>
         <w:spacing w:before="240"/>
-      </w:pPr>
-      <w:bookmarkStart w:id="113" w:name="_Toc900113"/>
-      <w:r>
+        <w:rPr>
+          <w:lang w:val="es-CL"/>
+        </w:rPr>
+      </w:pPr>
+      <w:bookmarkStart w:id="12" w:name="_Toc900113"/>
+      <w:r>
+        <w:rPr>
+          <w:lang w:val="es-CL"/>
+        </w:rPr>
+        <w:lastRenderedPageBreak/>
         <w:t>7. Bibliografía</w:t>
       </w:r>
-      <w:bookmarkEnd w:id="113"/>
+      <w:bookmarkEnd w:id="12"/>
     </w:p>
     <w:p>
       <w:pPr>
         <w:spacing w:after="160"/>
         <w:ind w:left="720" w:hanging="720"/>
-        <w:jc w:val="left"/>
-      </w:pPr>
-      <w:r>
-        <w:t xml:space="preserve">ChileCompra. (s. f.). </w:t>
+        <w:rPr>
+          <w:lang w:val="en-US"/>
+        </w:rPr>
+      </w:pPr>
+      <w:proofErr w:type="spellStart"/>
+      <w:r>
+        <w:t>ChileCompra</w:t>
+      </w:r>
+      <w:proofErr w:type="spellEnd"/>
+      <w:r>
+        <w:t xml:space="preserve">. (s. f.). </w:t>
       </w:r>
       <w:r>
         <w:rPr>
@@ -4256,17 +4863,15 @@
         <w:t>Datos abiertos del sistema de compras públicas</w:t>
       </w:r>
       <w:r>
-        <w:t>.</w:t>
-      </w:r>
-      <w:r>
-        <w:t xml:space="preserve"> </w:t>
-      </w:r>
-      <w:hyperlink r:id="rId44" w:history="1">
+        <w:t xml:space="preserve">. </w:t>
+      </w:r>
+      <w:hyperlink r:id="rId25" w:history="1">
         <w:r>
           <w:rPr>
             <w:rStyle w:val="Hipervnculo"/>
-          </w:rPr>
-          <w:t xml:space="preserve">https://datos-abiertos.chilecompra.cl/descargas</w:t>
+            <w:lang w:val="en-US"/>
+          </w:rPr>
+          <w:t>https://datos-abiertos.chilecompra.cl/descargas</w:t>
         </w:r>
       </w:hyperlink>
     </w:p>
@@ -4274,18 +4879,49 @@
       <w:pPr>
         <w:spacing w:after="160"/>
         <w:ind w:left="720" w:hanging="720"/>
-        <w:jc w:val="left"/>
-      </w:pPr>
-      <w:r>
-        <w:t xml:space="preserve">Cormen, T. H., Leiserson, C. E., Rivest, R. L., &amp; Stein, C. (2022). </w:t>
+        <w:rPr>
+          <w:lang w:val="en-US"/>
+        </w:rPr>
+      </w:pPr>
+      <w:proofErr w:type="spellStart"/>
+      <w:r>
+        <w:rPr>
+          <w:lang w:val="en-US"/>
+        </w:rPr>
+        <w:t>Cormen</w:t>
+      </w:r>
+      <w:proofErr w:type="spellEnd"/>
+      <w:r>
+        <w:rPr>
+          <w:lang w:val="en-US"/>
+        </w:rPr>
+        <w:t xml:space="preserve">, T. H., </w:t>
+      </w:r>
+      <w:proofErr w:type="spellStart"/>
+      <w:r>
+        <w:rPr>
+          <w:lang w:val="en-US"/>
+        </w:rPr>
+        <w:t>Leiserson</w:t>
+      </w:r>
+      <w:proofErr w:type="spellEnd"/>
+      <w:r>
+        <w:rPr>
+          <w:lang w:val="en-US"/>
+        </w:rPr>
+        <w:t xml:space="preserve">, C. E., Rivest, R. L., &amp; Stein, C. (2022). </w:t>
       </w:r>
       <w:r>
         <w:rPr>
           <w:i/>
+          <w:lang w:val="en-US"/>
         </w:rPr>
         <w:t>Introduction to algorithms</w:t>
       </w:r>
       <w:r>
+        <w:rPr>
+          <w:lang w:val="en-US"/>
+        </w:rPr>
         <w:t xml:space="preserve"> (4.ª ed.). MIT Press.</w:t>
       </w:r>
     </w:p>
@@ -4293,29 +4929,36 @@
       <w:pPr>
         <w:spacing w:after="160"/>
         <w:ind w:left="720" w:hanging="720"/>
-        <w:jc w:val="left"/>
-      </w:pPr>
-      <w:r>
+        <w:rPr>
+          <w:lang w:val="en-US"/>
+        </w:rPr>
+      </w:pPr>
+      <w:r>
+        <w:rPr>
+          <w:lang w:val="en-US"/>
+        </w:rPr>
         <w:t xml:space="preserve">Hunter, J. D. (2007). Matplotlib: A 2D graphics environment. </w:t>
       </w:r>
       <w:r>
         <w:rPr>
           <w:i/>
+          <w:lang w:val="en-US"/>
         </w:rPr>
         <w:t>Computing in Science &amp; Engineering, 9</w:t>
       </w:r>
       <w:r>
-        <w:t>(3), 90–95.</w:t>
-      </w:r>
-      <w:r>
-        <w:t xml:space="preserve"> </w:t>
-      </w:r>
-      <w:hyperlink r:id="rId45" w:history="1">
+        <w:rPr>
+          <w:lang w:val="en-US"/>
+        </w:rPr>
+        <w:t xml:space="preserve">(3), 90–95. </w:t>
+      </w:r>
+      <w:hyperlink r:id="rId26" w:history="1">
         <w:r>
           <w:rPr>
             <w:rStyle w:val="Hipervnculo"/>
-          </w:rPr>
-          <w:t xml:space="preserve">https://doi.org/10.1109/MCSE.2007.55</w:t>
+            <w:lang w:val="en-US"/>
+          </w:rPr>
+          <w:t>https://doi.org/10.1109/MCSE.2007.55</w:t>
         </w:r>
       </w:hyperlink>
     </w:p>
@@ -4323,37 +4966,69 @@
       <w:pPr>
         <w:spacing w:after="160"/>
         <w:ind w:left="720" w:hanging="720"/>
-        <w:jc w:val="left"/>
-      </w:pPr>
-      <w:r>
+        <w:rPr>
+          <w:lang w:val="en-US"/>
+        </w:rPr>
+      </w:pPr>
+      <w:r>
+        <w:rPr>
+          <w:lang w:val="en-US"/>
+        </w:rPr>
         <w:t xml:space="preserve">Lott, S. F., &amp; Phillips, D. (2021). </w:t>
       </w:r>
       <w:r>
         <w:rPr>
           <w:i/>
+          <w:lang w:val="en-US"/>
         </w:rPr>
         <w:t>Python object-oriented programming: Build robust and maintainable object-oriented Python applications and libraries</w:t>
       </w:r>
       <w:r>
-        <w:t xml:space="preserve"> (4.ª ed.). Packt Publishing.</w:t>
+        <w:rPr>
+          <w:lang w:val="en-US"/>
+        </w:rPr>
+        <w:t xml:space="preserve"> (4.ª ed.). </w:t>
+      </w:r>
+      <w:proofErr w:type="spellStart"/>
+      <w:r>
+        <w:rPr>
+          <w:lang w:val="en-US"/>
+        </w:rPr>
+        <w:t>Packt</w:t>
+      </w:r>
+      <w:proofErr w:type="spellEnd"/>
+      <w:r>
+        <w:rPr>
+          <w:lang w:val="en-US"/>
+        </w:rPr>
+        <w:t xml:space="preserve"> Publishing.</w:t>
       </w:r>
     </w:p>
     <w:p>
       <w:pPr>
         <w:spacing w:after="160"/>
         <w:ind w:left="720" w:hanging="720"/>
-        <w:jc w:val="left"/>
-      </w:pPr>
-      <w:r>
+        <w:rPr>
+          <w:lang w:val="en-US"/>
+        </w:rPr>
+      </w:pPr>
+      <w:r>
+        <w:rPr>
+          <w:lang w:val="en-US"/>
+        </w:rPr>
         <w:t xml:space="preserve">McKinney, W. (2022). </w:t>
       </w:r>
       <w:r>
         <w:rPr>
           <w:i/>
+          <w:lang w:val="en-US"/>
         </w:rPr>
         <w:t>Python for data analysis: Data wrangling with pandas, NumPy, and Jupyter</w:t>
       </w:r>
       <w:r>
+        <w:rPr>
+          <w:lang w:val="en-US"/>
+        </w:rPr>
         <w:t xml:space="preserve"> (3.ª ed.). O’Reilly Media.</w:t>
       </w:r>
     </w:p>
@@ -4361,29 +5036,45 @@
       <w:pPr>
         <w:spacing w:after="160"/>
         <w:ind w:left="720" w:hanging="720"/>
-        <w:jc w:val="left"/>
-      </w:pPr>
-      <w:r>
+        <w:rPr>
+          <w:lang w:val="en-US"/>
+        </w:rPr>
+      </w:pPr>
+      <w:r>
+        <w:rPr>
+          <w:lang w:val="en-US"/>
+        </w:rPr>
         <w:t xml:space="preserve">Python Software Foundation. (s. f.-a). </w:t>
       </w:r>
+      <w:proofErr w:type="spellStart"/>
       <w:r>
         <w:rPr>
           <w:i/>
-        </w:rPr>
-        <w:t>timeit — Measure execution time of small code snippets</w:t>
-      </w:r>
-      <w:r>
-        <w:t>. Python 3 documentation.</w:t>
-      </w:r>
-      <w:r>
-        <w:t xml:space="preserve"> </w:t>
-      </w:r>
-      <w:hyperlink r:id="rId46" w:history="1">
+          <w:lang w:val="en-US"/>
+        </w:rPr>
+        <w:t>timeit</w:t>
+      </w:r>
+      <w:proofErr w:type="spellEnd"/>
+      <w:r>
+        <w:rPr>
+          <w:i/>
+          <w:lang w:val="en-US"/>
+        </w:rPr>
+        <w:t xml:space="preserve"> — Measure execution time of small code snippets</w:t>
+      </w:r>
+      <w:r>
+        <w:rPr>
+          <w:lang w:val="en-US"/>
+        </w:rPr>
+        <w:t xml:space="preserve">. Python 3 documentation. </w:t>
+      </w:r>
+      <w:hyperlink r:id="rId27" w:history="1">
         <w:r>
           <w:rPr>
             <w:rStyle w:val="Hipervnculo"/>
-          </w:rPr>
-          <w:t xml:space="preserve">https://docs.python.org/3/library/timeit.html</w:t>
+            <w:lang w:val="en-US"/>
+          </w:rPr>
+          <w:t>https://docs.python.org/3/library/timeit.html</w:t>
         </w:r>
       </w:hyperlink>
     </w:p>
@@ -4391,29 +5082,45 @@
       <w:pPr>
         <w:spacing w:after="160"/>
         <w:ind w:left="720" w:hanging="720"/>
-        <w:jc w:val="left"/>
-      </w:pPr>
-      <w:r>
+        <w:rPr>
+          <w:lang w:val="en-US"/>
+        </w:rPr>
+      </w:pPr>
+      <w:r>
+        <w:rPr>
+          <w:lang w:val="en-US"/>
+        </w:rPr>
         <w:t xml:space="preserve">Python Software Foundation. (s. f.-b). </w:t>
       </w:r>
+      <w:proofErr w:type="spellStart"/>
       <w:r>
         <w:rPr>
           <w:i/>
-        </w:rPr>
-        <w:t>tracemalloc — Trace memory allocations</w:t>
-      </w:r>
-      <w:r>
-        <w:t>. Python 3 documentation.</w:t>
-      </w:r>
-      <w:r>
-        <w:t xml:space="preserve"> </w:t>
-      </w:r>
-      <w:hyperlink r:id="rId47" w:history="1">
+          <w:lang w:val="en-US"/>
+        </w:rPr>
+        <w:t>tracemalloc</w:t>
+      </w:r>
+      <w:proofErr w:type="spellEnd"/>
+      <w:r>
+        <w:rPr>
+          <w:i/>
+          <w:lang w:val="en-US"/>
+        </w:rPr>
+        <w:t xml:space="preserve"> — Trace memory allocations</w:t>
+      </w:r>
+      <w:r>
+        <w:rPr>
+          <w:lang w:val="en-US"/>
+        </w:rPr>
+        <w:t xml:space="preserve">. Python 3 documentation. </w:t>
+      </w:r>
+      <w:hyperlink r:id="rId28" w:history="1">
         <w:r>
           <w:rPr>
             <w:rStyle w:val="Hipervnculo"/>
-          </w:rPr>
-          <w:t xml:space="preserve">https://docs.python.org/3/library/tracemalloc.html</w:t>
+            <w:lang w:val="en-US"/>
+          </w:rPr>
+          <w:t>https://docs.python.org/3/library/tracemalloc.html</w:t>
         </w:r>
       </w:hyperlink>
     </w:p>
@@ -4421,29 +5128,45 @@
       <w:pPr>
         <w:spacing w:after="160"/>
         <w:ind w:left="720" w:hanging="720"/>
-        <w:jc w:val="left"/>
-      </w:pPr>
-      <w:r>
+        <w:rPr>
+          <w:lang w:val="en-US"/>
+        </w:rPr>
+      </w:pPr>
+      <w:r>
+        <w:rPr>
+          <w:lang w:val="en-US"/>
+        </w:rPr>
         <w:t xml:space="preserve">Python Software Foundation. (s. f.-c). </w:t>
       </w:r>
+      <w:proofErr w:type="spellStart"/>
       <w:r>
         <w:rPr>
           <w:i/>
-        </w:rPr>
-        <w:t>abc — Abstract base classes</w:t>
-      </w:r>
-      <w:r>
-        <w:t>. Python 3 documentation.</w:t>
-      </w:r>
-      <w:r>
-        <w:t xml:space="preserve"> </w:t>
-      </w:r>
-      <w:hyperlink r:id="rId48" w:history="1">
+          <w:lang w:val="en-US"/>
+        </w:rPr>
+        <w:t>abc</w:t>
+      </w:r>
+      <w:proofErr w:type="spellEnd"/>
+      <w:r>
+        <w:rPr>
+          <w:i/>
+          <w:lang w:val="en-US"/>
+        </w:rPr>
+        <w:t xml:space="preserve"> — Abstract base classes</w:t>
+      </w:r>
+      <w:r>
+        <w:rPr>
+          <w:lang w:val="en-US"/>
+        </w:rPr>
+        <w:t xml:space="preserve">. Python 3 documentation. </w:t>
+      </w:r>
+      <w:hyperlink r:id="rId29" w:history="1">
         <w:r>
           <w:rPr>
             <w:rStyle w:val="Hipervnculo"/>
-          </w:rPr>
-          <w:t xml:space="preserve">https://docs.python.org/3/library/abc.html</w:t>
+            <w:lang w:val="en-US"/>
+          </w:rPr>
+          <w:t>https://docs.python.org/3/library/abc.html</w:t>
         </w:r>
       </w:hyperlink>
     </w:p>
@@ -4451,29 +5174,73 @@
       <w:pPr>
         <w:spacing w:after="160"/>
         <w:ind w:left="720" w:hanging="720"/>
-        <w:jc w:val="left"/>
-      </w:pPr>
-      <w:r>
-        <w:t xml:space="preserve">Samuel, S., &amp; Mietchen, D. (2024). Computational reproducibility of Jupyter notebooks from biomedical publications. </w:t>
-      </w:r>
+        <w:rPr>
+          <w:lang w:val="en-US"/>
+        </w:rPr>
+      </w:pPr>
+      <w:r>
+        <w:rPr>
+          <w:lang w:val="en-US"/>
+        </w:rPr>
+        <w:t xml:space="preserve">Samuel, S., &amp; </w:t>
+      </w:r>
+      <w:proofErr w:type="spellStart"/>
+      <w:r>
+        <w:rPr>
+          <w:lang w:val="en-US"/>
+        </w:rPr>
+        <w:t>Mietchen</w:t>
+      </w:r>
+      <w:proofErr w:type="spellEnd"/>
+      <w:r>
+        <w:rPr>
+          <w:lang w:val="en-US"/>
+        </w:rPr>
+        <w:t xml:space="preserve">, D. (2024). Computational reproducibility of Jupyter notebooks from biomedical publications. </w:t>
+      </w:r>
+      <w:proofErr w:type="spellStart"/>
       <w:r>
         <w:rPr>
           <w:i/>
-        </w:rPr>
-        <w:t>GigaScience, 13</w:t>
-      </w:r>
-      <w:r>
-        <w:t>, Artículo giad113.</w:t>
-      </w:r>
-      <w:r>
-        <w:t xml:space="preserve"> </w:t>
-      </w:r>
-      <w:hyperlink r:id="rId49" w:history="1">
+          <w:lang w:val="en-US"/>
+        </w:rPr>
+        <w:t>GigaScience</w:t>
+      </w:r>
+      <w:proofErr w:type="spellEnd"/>
+      <w:r>
+        <w:rPr>
+          <w:i/>
+          <w:lang w:val="en-US"/>
+        </w:rPr>
+        <w:t>, 13</w:t>
+      </w:r>
+      <w:r>
+        <w:rPr>
+          <w:lang w:val="en-US"/>
+        </w:rPr>
+        <w:t xml:space="preserve">, </w:t>
+      </w:r>
+      <w:proofErr w:type="spellStart"/>
+      <w:r>
+        <w:rPr>
+          <w:lang w:val="en-US"/>
+        </w:rPr>
+        <w:t>Artículo</w:t>
+      </w:r>
+      <w:proofErr w:type="spellEnd"/>
+      <w:r>
+        <w:rPr>
+          <w:lang w:val="en-US"/>
+        </w:rPr>
+        <w:t xml:space="preserve"> giad113. </w:t>
+      </w:r>
+      <w:hyperlink r:id="rId30" w:history="1">
         <w:r>
           <w:rPr>
             <w:rStyle w:val="Hipervnculo"/>
-          </w:rPr>
-          <w:t xml:space="preserve">https://doi.org/10.1093/gigascience/giad113</w:t>
+            <w:lang w:val="en-US"/>
+          </w:rPr>
+          <w:t>https://doi.org/10.1093/gigascience/giad113</w:t>
         </w:r>
       </w:hyperlink>
     </w:p>
@@ -4481,29 +5248,64 @@
       <w:pPr>
         <w:spacing w:after="160"/>
         <w:ind w:left="720" w:hanging="720"/>
-        <w:jc w:val="left"/>
-      </w:pPr>
-      <w:r>
-        <w:t xml:space="preserve">The pandas development team. (s. f.-a). </w:t>
-      </w:r>
+      </w:pPr>
+      <w:r>
+        <w:rPr>
+          <w:lang w:val="en-US"/>
+        </w:rPr>
+        <w:t xml:space="preserve">The </w:t>
+      </w:r>
+      <w:proofErr w:type="gramStart"/>
+      <w:r>
+        <w:rPr>
+          <w:lang w:val="en-US"/>
+        </w:rPr>
+        <w:t>pandas</w:t>
+      </w:r>
+      <w:proofErr w:type="gramEnd"/>
+      <w:r>
+        <w:rPr>
+          <w:lang w:val="en-US"/>
+        </w:rPr>
+        <w:t xml:space="preserve"> development team. (s. f.-a). </w:t>
+      </w:r>
+      <w:proofErr w:type="spellStart"/>
+      <w:proofErr w:type="gramStart"/>
       <w:r>
         <w:rPr>
           <w:i/>
+          <w:lang w:val="en-US"/>
         </w:rPr>
         <w:t>pandas.DataFrame.groupby</w:t>
       </w:r>
-      <w:r>
-        <w:t>. pandas documentation.</w:t>
-      </w:r>
-      <w:r>
-        <w:t xml:space="preserve"> </w:t>
-      </w:r>
-      <w:hyperlink r:id="rId50" w:history="1">
+      <w:proofErr w:type="spellEnd"/>
+      <w:proofErr w:type="gramEnd"/>
+      <w:r>
+        <w:rPr>
+          <w:lang w:val="en-US"/>
+        </w:rPr>
+        <w:t xml:space="preserve">. </w:t>
+      </w:r>
+      <w:proofErr w:type="gramStart"/>
+      <w:r>
+        <w:rPr>
+          <w:lang w:val="en-US"/>
+        </w:rPr>
+        <w:t>pandas</w:t>
+      </w:r>
+      <w:proofErr w:type="gramEnd"/>
+      <w:r>
+        <w:rPr>
+          <w:lang w:val="en-US"/>
+        </w:rPr>
+        <w:t xml:space="preserve"> documentation. </w:t>
+      </w:r>
+      <w:hyperlink r:id="rId31" w:history="1">
         <w:r>
           <w:rPr>
             <w:rStyle w:val="Hipervnculo"/>
           </w:rPr>
-          <w:t xml:space="preserve">https://pandas.pydata.org/docs/reference/api/pandas.DataFrame.groupby.html</w:t>
+          <w:t>https://pandas.pydata.org/docs/reference/api/pandas.DataFrame.groupby.html</w:t>
         </w:r>
       </w:hyperlink>
     </w:p>
@@ -4511,29 +5313,71 @@
       <w:pPr>
         <w:spacing w:after="160"/>
         <w:ind w:left="720" w:hanging="720"/>
-        <w:jc w:val="left"/>
-      </w:pPr>
-      <w:r>
-        <w:t xml:space="preserve">The pandas development team. (s. f.-b). </w:t>
-      </w:r>
+      </w:pPr>
+      <w:r>
+        <w:rPr>
+          <w:lang w:val="en-US"/>
+        </w:rPr>
+        <w:t xml:space="preserve">The </w:t>
+      </w:r>
+      <w:proofErr w:type="gramStart"/>
+      <w:r>
+        <w:rPr>
+          <w:lang w:val="en-US"/>
+        </w:rPr>
+        <w:t>pandas</w:t>
+      </w:r>
+      <w:proofErr w:type="gramEnd"/>
+      <w:r>
+        <w:rPr>
+          <w:lang w:val="en-US"/>
+        </w:rPr>
+        <w:t xml:space="preserve"> development team. (s. f.-b). </w:t>
+      </w:r>
+      <w:proofErr w:type="spellStart"/>
+      <w:proofErr w:type="gramStart"/>
       <w:r>
         <w:rPr>
           <w:i/>
-        </w:rPr>
-        <w:t>pandas.read_csv</w:t>
-      </w:r>
-      <w:r>
-        <w:t>. pandas documentation.</w:t>
-      </w:r>
-      <w:r>
-        <w:t xml:space="preserve"> </w:t>
-      </w:r>
-      <w:hyperlink r:id="rId51" w:history="1">
+          <w:lang w:val="en-US"/>
+        </w:rPr>
+        <w:t>pandas.read</w:t>
+      </w:r>
+      <w:proofErr w:type="gramEnd"/>
+      <w:r>
+        <w:rPr>
+          <w:i/>
+          <w:lang w:val="en-US"/>
+        </w:rPr>
+        <w:t>_csv</w:t>
+      </w:r>
+      <w:proofErr w:type="spellEnd"/>
+      <w:r>
+        <w:rPr>
+          <w:lang w:val="en-US"/>
+        </w:rPr>
+        <w:t xml:space="preserve">. </w:t>
+      </w:r>
+      <w:proofErr w:type="gramStart"/>
+      <w:r>
+        <w:rPr>
+          <w:lang w:val="en-US"/>
+        </w:rPr>
+        <w:t>pandas</w:t>
+      </w:r>
+      <w:proofErr w:type="gramEnd"/>
+      <w:r>
+        <w:rPr>
+          <w:lang w:val="en-US"/>
+        </w:rPr>
+        <w:t xml:space="preserve"> documentation. </w:t>
+      </w:r>
+      <w:hyperlink r:id="rId32" w:history="1">
         <w:r>
           <w:rPr>
             <w:rStyle w:val="Hipervnculo"/>
           </w:rPr>
-          <w:t xml:space="preserve">https://pandas.pydata.org/docs/reference/api/pandas.read_csv.html</w:t>
+          <w:t>https://pandas.pydata.org/docs/reference/api/pandas.read_csv.html</w:t>
         </w:r>
       </w:hyperlink>
     </w:p>
@@ -4541,7 +5385,6 @@
       <w:pPr>
         <w:spacing w:after="160"/>
         <w:ind w:left="720" w:hanging="720"/>
-        <w:jc w:val="left"/>
       </w:pPr>
       <w:r>
         <w:t xml:space="preserve">Universidad Andrés Bello. (2026a). </w:t>
@@ -4553,14 +5396,24 @@
         <w:t>Fase 4: Presentación y comunicación del proyecto</w:t>
       </w:r>
       <w:r>
-        <w:t xml:space="preserve"> [Material del curso MCDI500]. Canvas UNAB.</w:t>
+        <w:t xml:space="preserve"> [Material del curso MCDI500]. </w:t>
+      </w:r>
+      <w:proofErr w:type="spellStart"/>
+      <w:r>
+        <w:t>Canvas</w:t>
+      </w:r>
+      <w:proofErr w:type="spellEnd"/>
+      <w:r>
+        <w:t xml:space="preserve"> UNAB.</w:t>
       </w:r>
     </w:p>
     <w:p>
       <w:pPr>
         <w:spacing w:after="160"/>
         <w:ind w:left="720" w:hanging="720"/>
-        <w:jc w:val="left"/>
+        <w:rPr>
+          <w:lang w:val="en-US"/>
+        </w:rPr>
       </w:pPr>
       <w:r>
         <w:t xml:space="preserve">Universidad Andrés Bello. (2026b). </w:t>
@@ -4572,46 +5425,71 @@
         <w:t>Sumativa 3: Proyecto final integrador Fase 4 – Análisis, reproducibilidad y comunicación de resultados</w:t>
       </w:r>
       <w:r>
-        <w:t xml:space="preserve"> [Pauta y rúbrica del curso MCDI500]. Canvas UNAB.</w:t>
+        <w:t xml:space="preserve"> [Pauta y rúbrica del curso MCDI500]. </w:t>
+      </w:r>
+      <w:r>
+        <w:rPr>
+          <w:lang w:val="en-US"/>
+        </w:rPr>
+        <w:t>Canvas UNAB.</w:t>
       </w:r>
     </w:p>
     <w:p>
       <w:pPr>
         <w:spacing w:after="160"/>
         <w:ind w:left="720" w:hanging="720"/>
-        <w:jc w:val="left"/>
-      </w:pPr>
-      <w:r>
+      </w:pPr>
+      <w:r>
+        <w:rPr>
+          <w:lang w:val="en-US"/>
+        </w:rPr>
         <w:t xml:space="preserve">Waskom, M. L. (2021). seaborn: Statistical data visualization. </w:t>
       </w:r>
       <w:r>
         <w:rPr>
           <w:i/>
-        </w:rPr>
-        <w:t>Journal of Open Source Software, 6</w:t>
-      </w:r>
-      <w:r>
-        <w:t>(60), 3021.</w:t>
-      </w:r>
-      <w:r>
-        <w:t xml:space="preserve"> </w:t>
-      </w:r>
-      <w:hyperlink r:id="rId52" w:history="1">
+          <w:lang w:val="en-US"/>
+        </w:rPr>
+        <w:t xml:space="preserve">Journal of </w:t>
+      </w:r>
+      <w:proofErr w:type="gramStart"/>
+      <w:r>
+        <w:rPr>
+          <w:i/>
+          <w:lang w:val="en-US"/>
+        </w:rPr>
+        <w:t>Open Source</w:t>
+      </w:r>
+      <w:proofErr w:type="gramEnd"/>
+      <w:r>
+        <w:rPr>
+          <w:i/>
+          <w:lang w:val="en-US"/>
+        </w:rPr>
+        <w:t xml:space="preserve"> Software, 6</w:t>
+      </w:r>
+      <w:r>
+        <w:rPr>
+          <w:lang w:val="en-US"/>
+        </w:rPr>
+        <w:t xml:space="preserve">(60), 3021. </w:t>
+      </w:r>
+      <w:hyperlink r:id="rId33" w:history="1">
         <w:r>
           <w:rPr>
             <w:rStyle w:val="Hipervnculo"/>
           </w:rPr>
-          <w:t xml:space="preserve">https://doi.org/10.21105/joss.03021</w:t>
+          <w:t>https://doi.org/10.21105/joss.03021</w:t>
         </w:r>
       </w:hyperlink>
     </w:p>
     <w:sectPr>
-      <w:headerReference w:type="even" r:id="rId33"/>
-      <w:headerReference w:type="default" r:id="rId34"/>
-      <w:footerReference w:type="even" r:id="rId35"/>
-      <w:footerReference w:type="default" r:id="rId36"/>
-      <w:headerReference w:type="first" r:id="rId37"/>
-      <w:footerReference w:type="first" r:id="rId38"/>
+      <w:headerReference w:type="even" r:id="rId34"/>
+      <w:headerReference w:type="default" r:id="rId35"/>
+      <w:footerReference w:type="even" r:id="rId36"/>
+      <w:footerReference w:type="default" r:id="rId37"/>
+      <w:headerReference w:type="first" r:id="rId38"/>
+      <w:footerReference w:type="first" r:id="rId39"/>
       <w:pgSz w:w="12240" w:h="15840"/>
       <w:pgMar w:top="1152" w:right="1152" w:bottom="1296" w:left="1152" w:header="432" w:footer="576" w:gutter="0"/>
       <w:cols w:space="720"/>
@@ -4994,7 +5872,7 @@
                     </wps:wsp>
                     <pic:pic xmlns:pic="http://schemas.openxmlformats.org/drawingml/2006/picture">
                       <pic:nvPicPr>
-                        <pic:cNvPr id="14" name="Image 14"/>
+                        <pic:cNvPr id="1675231486" name="Image 14"/>
                         <pic:cNvPicPr/>
                       </pic:nvPicPr>
                       <pic:blipFill>
@@ -5350,6 +6228,63 @@
     </w:lvl>
   </w:abstractNum>
   <w:abstractNum w:abstractNumId="1" w15:restartNumberingAfterBreak="0">
+    <w:nsid w:val="0CC33A4B"/>
+    <w:multiLevelType w:val="hybridMultilevel"/>
+    <w:tmpl w:val="43188014"/>
+    <w:lvl w:ilvl="0" w:tplc="E3C0D450">
+      <w:start w:val="1"/>
+      <w:numFmt w:val="bullet"/>
+      <w:lvlText w:val="•"/>
+      <w:lvlJc w:val="left"/>
+      <w:pPr>
+        <w:ind w:left="357" w:hanging="357"/>
+      </w:pPr>
+      <w:rPr>
+        <w:rFonts w:ascii="Arial" w:hAnsi="Arial"/>
+      </w:rPr>
+    </w:lvl>
+    <w:lvl w:ilvl="1" w:tplc="A55667C6">
+      <w:numFmt w:val="decimal"/>
+      <w:lvlText w:val=""/>
+      <w:lvlJc w:val="left"/>
+    </w:lvl>
+    <w:lvl w:ilvl="2" w:tplc="75500CAC">
+      <w:numFmt w:val="decimal"/>
+      <w:lvlText w:val=""/>
+      <w:lvlJc w:val="left"/>
+    </w:lvl>
+    <w:lvl w:ilvl="3" w:tplc="6352BF6A">
+      <w:numFmt w:val="decimal"/>
+      <w:lvlText w:val=""/>
+      <w:lvlJc w:val="left"/>
+    </w:lvl>
+    <w:lvl w:ilvl="4" w:tplc="C58AF496">
+      <w:numFmt w:val="decimal"/>
+      <w:lvlText w:val=""/>
+      <w:lvlJc w:val="left"/>
+    </w:lvl>
+    <w:lvl w:ilvl="5" w:tplc="E6AC10FE">
+      <w:numFmt w:val="decimal"/>
+      <w:lvlText w:val=""/>
+      <w:lvlJc w:val="left"/>
+    </w:lvl>
+    <w:lvl w:ilvl="6" w:tplc="5DA8516E">
+      <w:numFmt w:val="decimal"/>
+      <w:lvlText w:val=""/>
+      <w:lvlJc w:val="left"/>
+    </w:lvl>
+    <w:lvl w:ilvl="7" w:tplc="5BDC8752">
+      <w:numFmt w:val="decimal"/>
+      <w:lvlText w:val=""/>
+      <w:lvlJc w:val="left"/>
+    </w:lvl>
+    <w:lvl w:ilvl="8" w:tplc="D74AB8D2">
+      <w:numFmt w:val="decimal"/>
+      <w:lvlText w:val=""/>
+      <w:lvlJc w:val="left"/>
+    </w:lvl>
+  </w:abstractNum>
+  <w:abstractNum w:abstractNumId="2" w15:restartNumberingAfterBreak="0">
     <w:nsid w:val="116E5B54"/>
     <w:multiLevelType w:val="hybridMultilevel"/>
     <w:tmpl w:val="A3B278C8"/>
@@ -5441,7 +6376,7 @@
       </w:pPr>
     </w:lvl>
   </w:abstractNum>
-  <w:abstractNum w:abstractNumId="2" w15:restartNumberingAfterBreak="0">
+  <w:abstractNum w:abstractNumId="3" w15:restartNumberingAfterBreak="0">
     <w:nsid w:val="25317EF4"/>
     <w:multiLevelType w:val="hybridMultilevel"/>
     <w:tmpl w:val="E1F63A20"/>
@@ -5564,7 +6499,7 @@
       </w:rPr>
     </w:lvl>
   </w:abstractNum>
-  <w:abstractNum w:abstractNumId="3" w15:restartNumberingAfterBreak="0">
+  <w:abstractNum w:abstractNumId="4" w15:restartNumberingAfterBreak="0">
     <w:nsid w:val="2C090DB3"/>
     <w:multiLevelType w:val="hybridMultilevel"/>
     <w:tmpl w:val="901ACB7A"/>
@@ -5654,7 +6589,7 @@
       </w:pPr>
     </w:lvl>
   </w:abstractNum>
-  <w:abstractNum w:abstractNumId="4" w15:restartNumberingAfterBreak="0">
+  <w:abstractNum w:abstractNumId="5" w15:restartNumberingAfterBreak="0">
     <w:nsid w:val="44D03387"/>
     <w:multiLevelType w:val="hybridMultilevel"/>
     <w:tmpl w:val="84563E42"/>
@@ -5745,7 +6680,7 @@
       </w:pPr>
     </w:lvl>
   </w:abstractNum>
-  <w:abstractNum w:abstractNumId="5" w15:restartNumberingAfterBreak="0">
+  <w:abstractNum w:abstractNumId="6" w15:restartNumberingAfterBreak="0">
     <w:nsid w:val="4CE53233"/>
     <w:multiLevelType w:val="hybridMultilevel"/>
     <w:tmpl w:val="78A4D17C"/>
@@ -5835,7 +6770,7 @@
       </w:pPr>
     </w:lvl>
   </w:abstractNum>
-  <w:abstractNum w:abstractNumId="6" w15:restartNumberingAfterBreak="0">
+  <w:abstractNum w:abstractNumId="7" w15:restartNumberingAfterBreak="0">
     <w:nsid w:val="62385089"/>
     <w:multiLevelType w:val="hybridMultilevel"/>
     <w:tmpl w:val="E3AE1850"/>
@@ -5924,7 +6859,7 @@
       </w:pPr>
     </w:lvl>
   </w:abstractNum>
-  <w:abstractNum w:abstractNumId="7" w15:restartNumberingAfterBreak="0">
+  <w:abstractNum w:abstractNumId="8" w15:restartNumberingAfterBreak="0">
     <w:nsid w:val="7B426CE0"/>
     <w:multiLevelType w:val="hybridMultilevel"/>
     <w:tmpl w:val="13FC1F1E"/>
@@ -6010,29 +6945,14 @@
       </w:pPr>
     </w:lvl>
   </w:abstractNum>
-  <w:abstractNum w:abstractNumId="90">
-    <w:multiLevelType w:val="hybridMultilevel"/>
-    <w:lvl w:ilvl="0">
-      <w:start w:val="1"/>
-      <w:numFmt w:val="bullet"/>
-      <w:lvlText w:val="•"/>
-      <w:lvlJc w:val="left"/>
-      <w:pPr>
-        <w:ind w:left="357" w:hanging="357"/>
-      </w:pPr>
-      <w:rPr>
-        <w:rFonts w:ascii="Arial" w:hAnsi="Arial"/>
-      </w:rPr>
-    </w:lvl>
-  </w:abstractNum>
   <w:num w:numId="1" w16cid:durableId="1792236605">
-    <w:abstractNumId w:val="2"/>
+    <w:abstractNumId w:val="3"/>
   </w:num>
   <w:num w:numId="2" w16cid:durableId="1182664394">
     <w:abstractNumId w:val="0"/>
   </w:num>
   <w:num w:numId="3" w16cid:durableId="25719447">
-    <w:abstractNumId w:val="5"/>
+    <w:abstractNumId w:val="6"/>
     <w:lvlOverride w:ilvl="0">
       <w:startOverride w:val="1"/>
     </w:lvlOverride>
@@ -6062,22 +6982,22 @@
     </w:lvlOverride>
   </w:num>
   <w:num w:numId="4" w16cid:durableId="1739790130">
-    <w:abstractNumId w:val="3"/>
+    <w:abstractNumId w:val="4"/>
   </w:num>
   <w:num w:numId="5" w16cid:durableId="114713531">
-    <w:abstractNumId w:val="4"/>
+    <w:abstractNumId w:val="5"/>
   </w:num>
   <w:num w:numId="6" w16cid:durableId="1514028092">
+    <w:abstractNumId w:val="8"/>
+  </w:num>
+  <w:num w:numId="7" w16cid:durableId="701251958">
+    <w:abstractNumId w:val="2"/>
+  </w:num>
+  <w:num w:numId="8" w16cid:durableId="92289541">
     <w:abstractNumId w:val="7"/>
   </w:num>
-  <w:num w:numId="7" w16cid:durableId="701251958">
+  <w:num w:numId="9" w16cid:durableId="332991927">
     <w:abstractNumId w:val="1"/>
-  </w:num>
-  <w:num w:numId="8" w16cid:durableId="92289541">
-    <w:abstractNumId w:val="6"/>
-  </w:num>
-  <w:num w:numId="90">
-    <w:abstractNumId w:val="90"/>
   </w:num>
 </w:numbering>
 </file>
@@ -6533,7 +7453,6 @@
   <w:style w:type="character" w:default="1" w:styleId="Fuentedeprrafopredeter">
     <w:name w:val="Default Paragraph Font"/>
     <w:uiPriority w:val="1"/>
-    <w:semiHidden/>
     <w:unhideWhenUsed/>
   </w:style>
   <w:style w:type="table" w:default="1" w:styleId="Tablanormal">
@@ -7201,10 +8120,6 @@
 </file>
 
 <file path=customXml/item1.xml><?xml version="1.0" encoding="utf-8"?>
-<b:Sources xmlns:b="http://schemas.openxmlformats.org/officeDocument/2006/bibliography" xmlns="http://schemas.openxmlformats.org/officeDocument/2006/bibliography" SelectedStyle="\APASixthEditionOfficeOnline.xsl" StyleName="APA" Version="6"/>
-</file>
-
-<file path=customXml/item2.xml><?xml version="1.0" encoding="utf-8"?>
 <p:properties xmlns:p="http://schemas.microsoft.com/office/2006/metadata/properties" xmlns:xsi="http://www.w3.org/2001/XMLSchema-instance" xmlns:pc="http://schemas.microsoft.com/office/infopath/2007/PartnerControls">
   <documentManagement>
     <_ApprovalAssignedTo xmlns="0a2fff00-f002-44e7-b50c-b90cb65110b9">
@@ -7231,6 +8146,15 @@
     </_ApprovalSentBy>
   </documentManagement>
 </p:properties>
+</file>
+
+<file path=customXml/item2.xml><?xml version="1.0" encoding="utf-8"?>
+<?mso-contentType ?>
+<FormTemplates xmlns="http://schemas.microsoft.com/sharepoint/v3/contenttype/forms">
+  <Display>DocumentLibraryForm</Display>
+  <Edit>DocumentLibraryForm</Edit>
+  <New>DocumentLibraryForm</New>
+</FormTemplates>
 </file>
 
 <file path=customXml/item3.xml><?xml version="1.0" encoding="utf-8"?>
@@ -7438,28 +8362,23 @@
 </file>
 
 <file path=customXml/item4.xml><?xml version="1.0" encoding="utf-8"?>
-<?mso-contentType ?>
-<FormTemplates xmlns="http://schemas.microsoft.com/sharepoint/v3/contenttype/forms">
-  <Display>DocumentLibraryForm</Display>
-  <Edit>DocumentLibraryForm</Edit>
-  <New>DocumentLibraryForm</New>
-</FormTemplates>
+<b:Sources xmlns:b="http://schemas.openxmlformats.org/officeDocument/2006/bibliography" xmlns="http://schemas.openxmlformats.org/officeDocument/2006/bibliography" SelectedStyle="\APASixthEditionOfficeOnline.xsl" StyleName="APA" Version="6"/>
 </file>
 
 <file path=customXml/itemProps1.xml><?xml version="1.0" encoding="utf-8"?>
-<ds:datastoreItem xmlns:ds="http://schemas.openxmlformats.org/officeDocument/2006/customXml" ds:itemID="{FACB83BB-458E-4CCB-91D7-35CFBA93934D}">
+<ds:datastoreItem xmlns:ds="http://schemas.openxmlformats.org/officeDocument/2006/customXml" ds:itemID="{662F60C8-4BC5-4139-BE63-6954D22D77BD}">
   <ds:schemaRefs>
-    <ds:schemaRef ds:uri="http://schemas.openxmlformats.org/officeDocument/2006/bibliography"/>
+    <ds:schemaRef ds:uri="http://schemas.microsoft.com/office/2006/metadata/properties"/>
+    <ds:schemaRef ds:uri="http://schemas.microsoft.com/office/infopath/2007/PartnerControls"/>
+    <ds:schemaRef ds:uri="0a2fff00-f002-44e7-b50c-b90cb65110b9"/>
   </ds:schemaRefs>
 </ds:datastoreItem>
 </file>
 
 <file path=customXml/itemProps2.xml><?xml version="1.0" encoding="utf-8"?>
-<ds:datastoreItem xmlns:ds="http://schemas.openxmlformats.org/officeDocument/2006/customXml" ds:itemID="{662F60C8-4BC5-4139-BE63-6954D22D77BD}">
+<ds:datastoreItem xmlns:ds="http://schemas.openxmlformats.org/officeDocument/2006/customXml" ds:itemID="{084C26D9-49C9-4ADB-A387-DA6079798921}">
   <ds:schemaRefs>
-    <ds:schemaRef ds:uri="http://schemas.microsoft.com/office/2006/metadata/properties"/>
-    <ds:schemaRef ds:uri="http://schemas.microsoft.com/office/infopath/2007/PartnerControls"/>
-    <ds:schemaRef ds:uri="0a2fff00-f002-44e7-b50c-b90cb65110b9"/>
+    <ds:schemaRef ds:uri="http://schemas.microsoft.com/sharepoint/v3/contenttype/forms"/>
   </ds:schemaRefs>
 </ds:datastoreItem>
 </file>
@@ -7483,9 +8402,9 @@
 </file>
 
 <file path=customXml/itemProps4.xml><?xml version="1.0" encoding="utf-8"?>
-<ds:datastoreItem xmlns:ds="http://schemas.openxmlformats.org/officeDocument/2006/customXml" ds:itemID="{084C26D9-49C9-4ADB-A387-DA6079798921}">
+<ds:datastoreItem xmlns:ds="http://schemas.openxmlformats.org/officeDocument/2006/customXml" ds:itemID="{FACB83BB-458E-4CCB-91D7-35CFBA93934D}">
   <ds:schemaRefs>
-    <ds:schemaRef ds:uri="http://schemas.microsoft.com/sharepoint/v3/contenttype/forms"/>
+    <ds:schemaRef ds:uri="http://schemas.openxmlformats.org/officeDocument/2006/bibliography"/>
   </ds:schemaRefs>
 </ds:datastoreItem>
 </file>
</xml_diff>